<commit_message>
Rebuild Chapter 18 text slides and reflex media
</commit_message>
<xml_diff>
--- a/public/chapter-18/Chapitre_18_Vessie_version_complete_zones_reflexes_revisees.docx
+++ b/public/chapter-18/Chapitre_18_Vessie_version_complete_zones_reflexes_revisees.docx
@@ -14,7 +14,6 @@
     <w:p>
       <w:pPr>
         <w:pStyle w:val="Heading1"/>
-        <w:keepNext/>
         <w:spacing w:before="160" w:after="60"/>
         <w:rPr>
           <w:rFonts w:ascii="Times New Roman" w:hAnsi="Times New Roman" w:cs="Times New Roman"/>
@@ -39,95 +38,46 @@
           <w:sz w:val="24"/>
           <w:szCs w:val="24"/>
         </w:rPr>
-        <w:t>Les statistiques françaises admettent que 40% des femmes ont ou auront une incontinence urinaire d’effort au cours de leur vie. Ces incontinences surviennent au moment de la toux, l’éternuement, un effort de levage, des actes sexuel</w:t>
-      </w:r>
-      <w:r>
-        <w:rPr>
-          <w:rFonts w:ascii="Times New Roman" w:hAnsi="Times New Roman" w:cs="Times New Roman"/>
-          <w:sz w:val="24"/>
-          <w:szCs w:val="24"/>
-        </w:rPr>
-        <w:t>s, etc</w:t>
-      </w:r>
-      <w:r>
-        <w:rPr>
-          <w:rFonts w:ascii="Times New Roman" w:hAnsi="Times New Roman" w:cs="Times New Roman"/>
-          <w:sz w:val="24"/>
-          <w:szCs w:val="24"/>
-        </w:rPr>
-        <w:t>.</w:t>
-      </w:r>
-    </w:p>
-    <w:p>
-      <w:pPr>
-        <w:rPr>
-          <w:rFonts w:ascii="Times New Roman" w:hAnsi="Times New Roman" w:cs="Times New Roman"/>
-          <w:sz w:val="24"/>
-          <w:szCs w:val="24"/>
-        </w:rPr>
-      </w:pPr>
-      <w:r>
-        <w:rPr>
-          <w:rFonts w:ascii="Times New Roman" w:hAnsi="Times New Roman" w:cs="Times New Roman"/>
-          <w:sz w:val="24"/>
-          <w:szCs w:val="24"/>
-        </w:rPr>
-        <w:t>Près d’une femme sur deux, souffrira de cystite, cystalgie dans sa vie. Les causes infectieuses sont bien connues, mais beaucoup sont associées à l’activité génitale ou à une perturbation de la flore intes</w:t>
-      </w:r>
-      <w:r>
-        <w:rPr>
-          <w:rFonts w:ascii="Times New Roman" w:hAnsi="Times New Roman" w:cs="Times New Roman"/>
-          <w:sz w:val="24"/>
-          <w:szCs w:val="24"/>
-        </w:rPr>
-        <w:t>tinale. La vessie est très hormono-dépendante</w:t>
-      </w:r>
-      <w:r>
-        <w:rPr>
-          <w:rFonts w:ascii="Times New Roman" w:hAnsi="Times New Roman" w:cs="Times New Roman"/>
-          <w:sz w:val="24"/>
-          <w:szCs w:val="24"/>
-        </w:rPr>
-        <w:t>. Les troubles statiques du bassin au cours de la grossesse et de l’accouchement perturbent la dynamique de la vessie et favorisent la cystite.</w:t>
-      </w:r>
-    </w:p>
-    <w:p>
-      <w:pPr>
-        <w:rPr>
-          <w:rFonts w:ascii="Times New Roman" w:hAnsi="Times New Roman" w:cs="Times New Roman"/>
-          <w:sz w:val="24"/>
-          <w:szCs w:val="24"/>
-        </w:rPr>
-      </w:pPr>
-      <w:r>
-        <w:rPr>
-          <w:rFonts w:ascii="Times New Roman" w:hAnsi="Times New Roman" w:cs="Times New Roman"/>
-          <w:sz w:val="24"/>
-          <w:szCs w:val="24"/>
-        </w:rPr>
-        <w:t>Chez l’homme, c’est souvent à partir de la soixantaine, que les difficultés urinaires apparaissent. C’est la plupart du temps l’hypertrophie</w:t>
-      </w:r>
-      <w:r>
-        <w:rPr>
-          <w:rFonts w:ascii="Times New Roman" w:hAnsi="Times New Roman" w:cs="Times New Roman"/>
-          <w:sz w:val="24"/>
-          <w:szCs w:val="24"/>
-        </w:rPr>
-        <w:t xml:space="preserve"> bénigne</w:t>
-      </w:r>
-      <w:r>
-        <w:rPr>
-          <w:rFonts w:ascii="Times New Roman" w:hAnsi="Times New Roman" w:cs="Times New Roman"/>
-          <w:sz w:val="24"/>
-          <w:szCs w:val="24"/>
-        </w:rPr>
-        <w:t xml:space="preserve"> de la prostate qui en est la cause.</w:t>
+        <w:t>Les statistiques françaises admettent que 40% des femmes ont ou auront une incontinence urinaire d’effort au cours de leur vie. Ces incontinences surviennent au moment de la toux, l’éternuement, un effort de levage, des actes sexuels, etc.</w:t>
+      </w:r>
+    </w:p>
+    <w:p>
+      <w:pPr>
+        <w:rPr>
+          <w:rFonts w:ascii="Times New Roman" w:hAnsi="Times New Roman" w:cs="Times New Roman"/>
+          <w:sz w:val="24"/>
+          <w:szCs w:val="24"/>
+        </w:rPr>
+      </w:pPr>
+      <w:r>
+        <w:rPr>
+          <w:rFonts w:ascii="Times New Roman" w:hAnsi="Times New Roman" w:cs="Times New Roman"/>
+          <w:sz w:val="24"/>
+          <w:szCs w:val="24"/>
+        </w:rPr>
+        <w:t>Près d’une femme sur deux, souffrira de cystite, cystalgie dans sa vie. Les causes infectieuses sont bien connues, mais beaucoup sont associées à l’activité génitale ou à une perturbation de la flore intestinale. La vessie est très hormono-dépendante. Les troubles statiques du bassin au cours de la grossesse et de l’accouchement perturbent la dynamique de la vessie et favorisent la cystite.</w:t>
+      </w:r>
+    </w:p>
+    <w:p>
+      <w:pPr>
+        <w:rPr>
+          <w:rFonts w:ascii="Times New Roman" w:hAnsi="Times New Roman" w:cs="Times New Roman"/>
+          <w:sz w:val="24"/>
+          <w:szCs w:val="24"/>
+        </w:rPr>
+      </w:pPr>
+      <w:r>
+        <w:rPr>
+          <w:rFonts w:ascii="Times New Roman" w:hAnsi="Times New Roman" w:cs="Times New Roman"/>
+          <w:sz w:val="24"/>
+          <w:szCs w:val="24"/>
+        </w:rPr>
+        <w:t>Chez l’homme, c’est souvent à partir de la soixantaine, que les difficultés urinaires apparaissent. C’est la plupart du temps l’hypertrophie bénigne de la prostate qui en est la cause.</w:t>
       </w:r>
     </w:p>
     <w:p>
       <w:pPr>
         <w:pStyle w:val="Heading1"/>
-        <w:keepNext/>
         <w:spacing w:before="160" w:after="60"/>
         <w:rPr>
           <w:rFonts w:ascii="Times New Roman" w:hAnsi="Times New Roman" w:cs="Times New Roman"/>
@@ -163,21 +113,12 @@
           <w:sz w:val="24"/>
           <w:szCs w:val="24"/>
         </w:rPr>
-        <w:t>Organe réservoir de l’urine, la vessie est située dans la partie antérieure de la loge viscérale de la cavité pelvienne, logée dans un berceau entre les muscles élévateurs de l’anus du périnée et les muscles obturateurs internes.</w:t>
-      </w:r>
-      <w:r>
-        <w:rPr>
-          <w:rFonts w:ascii="Times New Roman" w:hAnsi="Times New Roman" w:cs="Times New Roman"/>
-          <w:sz w:val="24"/>
-          <w:szCs w:val="24"/>
-        </w:rPr>
-        <w:t xml:space="preserve"> </w:t>
+        <w:t xml:space="preserve">Organe réservoir de l’urine, la vessie est située dans la partie antérieure de la loge viscérale de la cavité pelvienne, logée dans un berceau entre les muscles élévateurs de l’anus du périnée et les muscles obturateurs internes. </w:t>
       </w:r>
     </w:p>
     <w:p>
       <w:pPr>
         <w:pStyle w:val="Heading2"/>
-        <w:keepNext/>
         <w:numPr>
           <w:ilvl w:val="0"/>
           <w:numId w:val="1"/>
@@ -187,12 +128,9 @@
         <w:jc w:val="both"/>
         <w:rPr>
           <w:rFonts w:ascii="Times New Roman" w:hAnsi="Times New Roman" w:cs="Times New Roman"/>
-          <w:sz w:val="24"/>
-          <w:szCs w:val="24"/>
-        </w:rPr>
-      </w:pPr>
-      <w:proofErr w:type="gramStart"/>
-      <w:proofErr w:type="gramEnd"/>
+          <w:szCs w:val="24"/>
+        </w:rPr>
+      </w:pPr>
       <w:r>
         <w:t>2.1. Chez la femme</w:t>
       </w:r>
@@ -213,23 +151,7 @@
           <w:sz w:val="24"/>
           <w:szCs w:val="24"/>
         </w:rPr>
-        <w:t>En arrière du</w:t>
-      </w:r>
-      <w:r>
-        <w:rPr>
-          <w:rFonts w:ascii="Times New Roman" w:hAnsi="Times New Roman" w:cs="Times New Roman"/>
-          <w:sz w:val="24"/>
-          <w:szCs w:val="24"/>
-        </w:rPr>
-        <w:t xml:space="preserve"> pubis</w:t>
-      </w:r>
-      <w:r>
-        <w:rPr>
-          <w:rFonts w:ascii="Times New Roman" w:hAnsi="Times New Roman" w:cs="Times New Roman"/>
-          <w:sz w:val="24"/>
-          <w:szCs w:val="24"/>
-        </w:rPr>
-        <w:t> ;</w:t>
+        <w:t>En arrière du pubis ;</w:t>
       </w:r>
     </w:p>
     <w:p>
@@ -253,55 +175,7 @@
           <w:sz w:val="24"/>
           <w:szCs w:val="24"/>
         </w:rPr>
-        <w:t>L</w:t>
-      </w:r>
-      <w:r>
-        <w:rPr>
-          <w:rFonts w:ascii="Times New Roman" w:hAnsi="Times New Roman" w:cs="Times New Roman"/>
-          <w:sz w:val="24"/>
-          <w:szCs w:val="24"/>
-        </w:rPr>
-        <w:t>a face supérieure, ou dôme v</w:t>
-      </w:r>
-      <w:r>
-        <w:rPr>
-          <w:rFonts w:ascii="Times New Roman" w:hAnsi="Times New Roman" w:cs="Times New Roman"/>
-          <w:sz w:val="24"/>
-          <w:szCs w:val="24"/>
-        </w:rPr>
-        <w:t>ésical, est recouverte, ventralement</w:t>
-      </w:r>
-      <w:r>
-        <w:rPr>
-          <w:rFonts w:ascii="Times New Roman" w:hAnsi="Times New Roman" w:cs="Times New Roman"/>
-          <w:sz w:val="24"/>
-          <w:szCs w:val="24"/>
-        </w:rPr>
-        <w:t>,</w:t>
-      </w:r>
-      <w:r>
-        <w:rPr>
-          <w:rFonts w:ascii="Times New Roman" w:hAnsi="Times New Roman" w:cs="Times New Roman"/>
-          <w:sz w:val="24"/>
-          <w:szCs w:val="24"/>
-        </w:rPr>
-        <w:t xml:space="preserve"> par le péritoine et, dorsalement</w:t>
-      </w:r>
-      <w:r>
-        <w:rPr>
-          <w:rFonts w:ascii="Times New Roman" w:hAnsi="Times New Roman" w:cs="Times New Roman"/>
-          <w:sz w:val="24"/>
-          <w:szCs w:val="24"/>
-        </w:rPr>
-        <w:t>, par le corps de l’utérus</w:t>
-      </w:r>
-      <w:r>
-        <w:rPr>
-          <w:rFonts w:ascii="Times New Roman" w:hAnsi="Times New Roman" w:cs="Times New Roman"/>
-          <w:sz w:val="24"/>
-          <w:szCs w:val="24"/>
-        </w:rPr>
-        <w:t> ;</w:t>
+        <w:t>La face supérieure, ou dôme vésical, est recouverte, ventralement, par le péritoine et, dorsalement, par le corps de l’utérus ;</w:t>
       </w:r>
     </w:p>
     <w:p>
@@ -335,15 +209,7 @@
           <w:sz w:val="24"/>
           <w:szCs w:val="24"/>
         </w:rPr>
-        <w:t xml:space="preserve"> face postéro-inférieure ou trigonale est posée sur le vagin</w:t>
-      </w:r>
-      <w:r>
-        <w:rPr>
-          <w:rFonts w:ascii="Times New Roman" w:hAnsi="Times New Roman" w:cs="Times New Roman"/>
-          <w:sz w:val="24"/>
-          <w:szCs w:val="24"/>
-        </w:rPr>
-        <w:t>.</w:t>
+        <w:t xml:space="preserve"> face postéro-inférieure ou trigonale est posée sur le vagin.</w:t>
       </w:r>
     </w:p>
     <w:p>
@@ -361,7 +227,6 @@
     <w:p>
       <w:pPr>
         <w:pStyle w:val="Heading2"/>
-        <w:keepNext/>
         <w:numPr>
           <w:ilvl w:val="0"/>
           <w:numId w:val="1"/>
@@ -371,12 +236,9 @@
         <w:jc w:val="both"/>
         <w:rPr>
           <w:rFonts w:ascii="Times New Roman" w:hAnsi="Times New Roman" w:cs="Times New Roman"/>
-          <w:sz w:val="24"/>
-          <w:szCs w:val="24"/>
-        </w:rPr>
-      </w:pPr>
-      <w:proofErr w:type="gramStart"/>
-      <w:proofErr w:type="gramEnd"/>
+          <w:szCs w:val="24"/>
+        </w:rPr>
+      </w:pPr>
       <w:r>
         <w:t>2.2. Chez l’homme</w:t>
       </w:r>
@@ -397,23 +259,7 @@
           <w:sz w:val="24"/>
           <w:szCs w:val="24"/>
         </w:rPr>
-        <w:t>En arrière d</w:t>
-      </w:r>
-      <w:r>
-        <w:rPr>
-          <w:rFonts w:ascii="Times New Roman" w:hAnsi="Times New Roman" w:cs="Times New Roman"/>
-          <w:sz w:val="24"/>
-          <w:szCs w:val="24"/>
-        </w:rPr>
-        <w:t>u pubis</w:t>
-      </w:r>
-      <w:r>
-        <w:rPr>
-          <w:rFonts w:ascii="Times New Roman" w:hAnsi="Times New Roman" w:cs="Times New Roman"/>
-          <w:sz w:val="24"/>
-          <w:szCs w:val="24"/>
-        </w:rPr>
-        <w:t> ;</w:t>
+        <w:t>En arrière du pubis ;</w:t>
       </w:r>
     </w:p>
     <w:p>
@@ -437,15 +283,7 @@
           <w:sz w:val="24"/>
           <w:szCs w:val="24"/>
         </w:rPr>
-        <w:t>le dôme vésical est recouvert par le péritoine</w:t>
-      </w:r>
-      <w:r>
-        <w:rPr>
-          <w:rFonts w:ascii="Times New Roman" w:hAnsi="Times New Roman" w:cs="Times New Roman"/>
-          <w:sz w:val="24"/>
-          <w:szCs w:val="24"/>
-        </w:rPr>
-        <w:t> ;</w:t>
+        <w:t>le dôme vésical est recouvert par le péritoine ;</w:t>
       </w:r>
     </w:p>
     <w:p>
@@ -503,39 +341,7 @@
           <w:sz w:val="24"/>
           <w:szCs w:val="24"/>
         </w:rPr>
-        <w:t xml:space="preserve"> face postéro-inférieu</w:t>
-      </w:r>
-      <w:r>
-        <w:rPr>
-          <w:rFonts w:ascii="Times New Roman" w:hAnsi="Times New Roman" w:cs="Times New Roman"/>
-          <w:sz w:val="24"/>
-          <w:szCs w:val="24"/>
-        </w:rPr>
-        <w:t>re ou trigonale est</w:t>
-      </w:r>
-      <w:r>
-        <w:rPr>
-          <w:rFonts w:ascii="Times New Roman" w:hAnsi="Times New Roman" w:cs="Times New Roman"/>
-          <w:sz w:val="24"/>
-          <w:szCs w:val="24"/>
-        </w:rPr>
-        <w:t xml:space="preserve"> </w:t>
-      </w:r>
-      <w:r>
-        <w:rPr>
-          <w:rFonts w:ascii="Times New Roman" w:hAnsi="Times New Roman" w:cs="Times New Roman"/>
-          <w:sz w:val="24"/>
-          <w:szCs w:val="24"/>
-        </w:rPr>
-        <w:t>en avant du rectum</w:t>
-      </w:r>
-      <w:r>
-        <w:rPr>
-          <w:rFonts w:ascii="Times New Roman" w:hAnsi="Times New Roman" w:cs="Times New Roman"/>
-          <w:sz w:val="24"/>
-          <w:szCs w:val="24"/>
-        </w:rPr>
-        <w:t>.</w:t>
+        <w:t xml:space="preserve"> face postéro-inférieure ou trigonale est en avant du rectum.</w:t>
       </w:r>
     </w:p>
     <w:p>
@@ -565,63 +371,7 @@
           <w:sz w:val="24"/>
           <w:szCs w:val="24"/>
         </w:rPr>
-        <w:t>La partie supérieure</w:t>
-      </w:r>
-      <w:r>
-        <w:rPr>
-          <w:rFonts w:ascii="Times New Roman" w:hAnsi="Times New Roman" w:cs="Times New Roman"/>
-          <w:sz w:val="24"/>
-          <w:szCs w:val="24"/>
-        </w:rPr>
-        <w:t xml:space="preserve"> ou corps</w:t>
-      </w:r>
-      <w:r>
-        <w:rPr>
-          <w:rFonts w:ascii="Times New Roman" w:hAnsi="Times New Roman" w:cs="Times New Roman"/>
-          <w:sz w:val="24"/>
-          <w:szCs w:val="24"/>
-        </w:rPr>
-        <w:t xml:space="preserve"> de la vessie est </w:t>
-      </w:r>
-      <w:r>
-        <w:rPr>
-          <w:rFonts w:ascii="Times New Roman" w:hAnsi="Times New Roman" w:cs="Times New Roman"/>
-          <w:sz w:val="24"/>
-          <w:szCs w:val="24"/>
-        </w:rPr>
-        <w:t xml:space="preserve">mobile. La partie inférieure </w:t>
-      </w:r>
-      <w:r>
-        <w:rPr>
-          <w:rFonts w:ascii="Times New Roman" w:hAnsi="Times New Roman" w:cs="Times New Roman"/>
-          <w:sz w:val="24"/>
-          <w:szCs w:val="24"/>
-        </w:rPr>
-        <w:t>comprenant la</w:t>
-      </w:r>
-      <w:r>
-        <w:rPr>
-          <w:rFonts w:ascii="Times New Roman" w:hAnsi="Times New Roman" w:cs="Times New Roman"/>
-          <w:sz w:val="24"/>
-          <w:szCs w:val="24"/>
-        </w:rPr>
-        <w:t xml:space="preserve"> base</w:t>
-      </w:r>
-      <w:r>
-        <w:rPr>
-          <w:rFonts w:ascii="Times New Roman" w:hAnsi="Times New Roman" w:cs="Times New Roman"/>
-          <w:sz w:val="24"/>
-          <w:szCs w:val="24"/>
-        </w:rPr>
-        <w:t xml:space="preserve"> et le col</w:t>
-      </w:r>
-      <w:r>
-        <w:rPr>
-          <w:rFonts w:ascii="Times New Roman" w:hAnsi="Times New Roman" w:cs="Times New Roman"/>
-          <w:sz w:val="24"/>
-          <w:szCs w:val="24"/>
-        </w:rPr>
-        <w:t>, est fixée, solidaire de l’urètre et, par son intermédiaire, au plancher pelvien.</w:t>
+        <w:t>La partie supérieure ou corps de la vessie est mobile. La partie inférieure comprenant la base et le col, est fixée, solidaire de l’urètre et, par son intermédiaire, au plancher pelvien.</w:t>
       </w:r>
     </w:p>
     <w:p>
@@ -639,47 +389,7 @@
           <w:sz w:val="24"/>
           <w:szCs w:val="24"/>
         </w:rPr>
-        <w:t>Vide, la vessie</w:t>
-      </w:r>
-      <w:r>
-        <w:rPr>
-          <w:rFonts w:ascii="Times New Roman" w:hAnsi="Times New Roman" w:cs="Times New Roman"/>
-          <w:sz w:val="24"/>
-          <w:szCs w:val="24"/>
-        </w:rPr>
-        <w:t xml:space="preserve"> est aplatie</w:t>
-      </w:r>
-      <w:r>
-        <w:rPr>
-          <w:rFonts w:ascii="Times New Roman" w:hAnsi="Times New Roman" w:cs="Times New Roman"/>
-          <w:sz w:val="24"/>
-          <w:szCs w:val="24"/>
-        </w:rPr>
-        <w:t xml:space="preserve"> et non palpable. Pleine, elle est glob</w:t>
-      </w:r>
-      <w:r>
-        <w:rPr>
-          <w:rFonts w:ascii="Times New Roman" w:hAnsi="Times New Roman" w:cs="Times New Roman"/>
-          <w:sz w:val="24"/>
-          <w:szCs w:val="24"/>
-        </w:rPr>
-        <w:t>uleuse, ovoïde et dépasse en haut le</w:t>
-      </w:r>
-      <w:r>
-        <w:rPr>
-          <w:rFonts w:ascii="Times New Roman" w:hAnsi="Times New Roman" w:cs="Times New Roman"/>
-          <w:sz w:val="24"/>
-          <w:szCs w:val="24"/>
-        </w:rPr>
-        <w:t xml:space="preserve"> pubis pour rentrer dans la cavité abdominale</w:t>
-      </w:r>
-      <w:r>
-        <w:rPr>
-          <w:rFonts w:ascii="Times New Roman" w:hAnsi="Times New Roman" w:cs="Times New Roman"/>
-          <w:sz w:val="24"/>
-          <w:szCs w:val="24"/>
-        </w:rPr>
-        <w:t xml:space="preserve">. </w:t>
+        <w:t xml:space="preserve">Vide, la vessie est aplatie et non palpable. Pleine, elle est globuleuse, ovoïde et dépasse en haut le pubis pour rentrer dans la cavité abdominale. </w:t>
       </w:r>
     </w:p>
     <w:p>
@@ -696,7 +406,6 @@
     <w:p>
       <w:pPr>
         <w:pStyle w:val="Heading1"/>
-        <w:keepNext/>
         <w:spacing w:before="160" w:after="60"/>
         <w:rPr>
           <w:rFonts w:ascii="Times New Roman" w:hAnsi="Times New Roman" w:cs="Times New Roman"/>
@@ -715,17 +424,16 @@
     <w:p>
       <w:pPr>
         <w:pStyle w:val="Heading2"/>
-        <w:keepNext/>
         <w:spacing w:before="100" w:after="60"/>
       </w:pPr>
       <w:r>
+        <w:lastRenderedPageBreak/>
         <w:t>3.1. Parois de la vessie</w:t>
       </w:r>
     </w:p>
     <w:p>
       <w:pPr>
-        <w:pStyle w:val="Heading3"/>
-        <w:keepNext/>
+        <w:pStyle w:val="Heading31"/>
         <w:spacing w:before="100" w:after="60"/>
       </w:pPr>
       <w:r>
@@ -747,8 +455,7 @@
     </w:p>
     <w:p>
       <w:pPr>
-        <w:pStyle w:val="Heading3"/>
-        <w:keepNext/>
+        <w:pStyle w:val="Heading31"/>
         <w:spacing w:before="100" w:after="60"/>
       </w:pPr>
       <w:r>
@@ -810,39 +517,7 @@
           <w:sz w:val="24"/>
           <w:szCs w:val="24"/>
         </w:rPr>
-        <w:t>-vésicaux</w:t>
-      </w:r>
-      <w:r>
-        <w:rPr>
-          <w:rFonts w:ascii="Times New Roman" w:hAnsi="Times New Roman" w:cs="Times New Roman"/>
-          <w:sz w:val="24"/>
-          <w:szCs w:val="24"/>
-        </w:rPr>
-        <w:t xml:space="preserve">. </w:t>
-      </w:r>
-      <w:r>
-        <w:rPr>
-          <w:rFonts w:ascii="Times New Roman" w:hAnsi="Times New Roman" w:cs="Times New Roman"/>
-          <w:sz w:val="24"/>
-          <w:szCs w:val="24"/>
-        </w:rPr>
-        <w:t>Toute</w:t>
-      </w:r>
-      <w:r>
-        <w:rPr>
-          <w:rFonts w:ascii="Times New Roman" w:hAnsi="Times New Roman" w:cs="Times New Roman"/>
-          <w:sz w:val="24"/>
-          <w:szCs w:val="24"/>
-        </w:rPr>
-        <w:t xml:space="preserve"> tension asymétrique des ligamen</w:t>
-      </w:r>
-      <w:r>
-        <w:rPr>
-          <w:rFonts w:ascii="Times New Roman" w:hAnsi="Times New Roman" w:cs="Times New Roman"/>
-          <w:sz w:val="24"/>
-          <w:szCs w:val="24"/>
-        </w:rPr>
-        <w:t xml:space="preserve">ts </w:t>
+        <w:t xml:space="preserve">-vésicaux. Toute tension asymétrique des ligaments </w:t>
       </w:r>
       <w:proofErr w:type="spellStart"/>
       <w:r>
@@ -860,63 +535,7 @@
           <w:sz w:val="24"/>
           <w:szCs w:val="24"/>
         </w:rPr>
-        <w:t xml:space="preserve">-vésicaux </w:t>
-      </w:r>
-      <w:r>
-        <w:rPr>
-          <w:rFonts w:ascii="Times New Roman" w:hAnsi="Times New Roman" w:cs="Times New Roman"/>
-          <w:sz w:val="24"/>
-          <w:szCs w:val="24"/>
-        </w:rPr>
-        <w:t>est</w:t>
-      </w:r>
-      <w:r>
-        <w:rPr>
-          <w:rFonts w:ascii="Times New Roman" w:hAnsi="Times New Roman" w:cs="Times New Roman"/>
-          <w:sz w:val="24"/>
-          <w:szCs w:val="24"/>
-        </w:rPr>
-        <w:t xml:space="preserve"> responsable d’une envie </w:t>
-      </w:r>
-      <w:r>
-        <w:rPr>
-          <w:rFonts w:ascii="Times New Roman" w:hAnsi="Times New Roman" w:cs="Times New Roman"/>
-          <w:sz w:val="24"/>
-          <w:szCs w:val="24"/>
-        </w:rPr>
-        <w:t xml:space="preserve">impérieuse d’uriner par </w:t>
-      </w:r>
-      <w:r>
-        <w:rPr>
-          <w:rFonts w:ascii="Times New Roman" w:hAnsi="Times New Roman" w:cs="Times New Roman"/>
-          <w:sz w:val="24"/>
-          <w:szCs w:val="24"/>
-        </w:rPr>
-        <w:t xml:space="preserve">contraction anormale et permanente de la vessie entraînant une </w:t>
-      </w:r>
-      <w:r>
-        <w:rPr>
-          <w:rFonts w:ascii="Times New Roman" w:hAnsi="Times New Roman" w:cs="Times New Roman"/>
-          <w:sz w:val="24"/>
-          <w:szCs w:val="24"/>
-        </w:rPr>
-        <w:t>diminution de la capa</w:t>
-      </w:r>
-      <w:r>
-        <w:rPr>
-          <w:rFonts w:ascii="Times New Roman" w:hAnsi="Times New Roman" w:cs="Times New Roman"/>
-          <w:sz w:val="24"/>
-          <w:szCs w:val="24"/>
-        </w:rPr>
-        <w:t>cité de remplissage</w:t>
-      </w:r>
-      <w:r>
-        <w:rPr>
-          <w:rFonts w:ascii="Times New Roman" w:hAnsi="Times New Roman" w:cs="Times New Roman"/>
-          <w:sz w:val="24"/>
-          <w:szCs w:val="24"/>
-        </w:rPr>
-        <w:t xml:space="preserve"> (éréthisme vésical).</w:t>
+        <w:t>-vésicaux est responsable d’une envie impérieuse d’uriner par contraction anormale et permanente de la vessie entraînant une diminution de la capacité de remplissage (éréthisme vésical).</w:t>
       </w:r>
     </w:p>
     <w:p>
@@ -952,16 +571,7 @@
           <w:sz w:val="24"/>
           <w:szCs w:val="24"/>
         </w:rPr>
-        <w:t>sphincter liss</w:t>
-      </w:r>
-      <w:r>
-        <w:rPr>
-          <w:rFonts w:ascii="Times New Roman" w:hAnsi="Times New Roman" w:cs="Times New Roman"/>
-          <w:i/>
-          <w:sz w:val="24"/>
-          <w:szCs w:val="24"/>
-        </w:rPr>
-        <w:t>e.</w:t>
+        <w:t>sphincter lisse.</w:t>
       </w:r>
     </w:p>
     <w:p>
@@ -993,8 +603,7 @@
     </w:p>
     <w:p>
       <w:pPr>
-        <w:pStyle w:val="Heading3"/>
-        <w:keepNext/>
+        <w:pStyle w:val="Heading31"/>
         <w:spacing w:before="100" w:after="60"/>
       </w:pPr>
       <w:r>
@@ -1017,7 +626,6 @@
     <w:p>
       <w:pPr>
         <w:pStyle w:val="Heading2"/>
-        <w:keepNext/>
         <w:spacing w:before="100" w:after="60"/>
       </w:pPr>
       <w:r>
@@ -1057,15 +665,7 @@
           <w:sz w:val="24"/>
           <w:szCs w:val="24"/>
         </w:rPr>
-        <w:t>Deux orifices urétéraux</w:t>
-      </w:r>
-      <w:r>
-        <w:rPr>
-          <w:rFonts w:ascii="Times New Roman" w:hAnsi="Times New Roman" w:cs="Times New Roman"/>
-          <w:sz w:val="24"/>
-          <w:szCs w:val="24"/>
-        </w:rPr>
-        <w:t> ;</w:t>
+        <w:t>Deux orifices urétéraux ;</w:t>
       </w:r>
     </w:p>
     <w:p>
@@ -1088,15 +688,7 @@
           <w:sz w:val="24"/>
           <w:szCs w:val="24"/>
         </w:rPr>
-        <w:t>Un orifice urétral</w:t>
-      </w:r>
-      <w:r>
-        <w:rPr>
-          <w:rFonts w:ascii="Times New Roman" w:hAnsi="Times New Roman" w:cs="Times New Roman"/>
-          <w:sz w:val="24"/>
-          <w:szCs w:val="24"/>
-        </w:rPr>
-        <w:t>.</w:t>
+        <w:t>Un orifice urétral.</w:t>
       </w:r>
     </w:p>
     <w:p>
@@ -1115,7 +707,6 @@
     <w:p>
       <w:pPr>
         <w:pStyle w:val="Heading2"/>
-        <w:keepNext/>
         <w:spacing w:before="100" w:after="60"/>
       </w:pPr>
       <w:r>
@@ -1143,7 +734,6 @@
     <w:p>
       <w:pPr>
         <w:pStyle w:val="Heading2"/>
-        <w:keepNext/>
         <w:spacing w:before="100" w:after="60"/>
       </w:pPr>
       <w:r>
@@ -1171,7 +761,6 @@
     <w:p>
       <w:pPr>
         <w:pStyle w:val="Heading2"/>
-        <w:keepNext/>
         <w:numPr>
           <w:ilvl w:val="0"/>
           <w:numId w:val="7"/>
@@ -1180,8 +769,6 @@
         <w:jc w:val="both"/>
         <w:rPr>
           <w:rFonts w:ascii="Times New Roman" w:hAnsi="Times New Roman" w:cs="Times New Roman"/>
-          <w:b/>
-          <w:sz w:val="24"/>
           <w:szCs w:val="24"/>
         </w:rPr>
       </w:pPr>
@@ -1191,8 +778,7 @@
     </w:p>
     <w:p>
       <w:pPr>
-        <w:pStyle w:val="Heading3"/>
-        <w:keepNext/>
+        <w:pStyle w:val="Heading31"/>
         <w:numPr>
           <w:ilvl w:val="0"/>
           <w:numId w:val="8"/>
@@ -1201,7 +787,6 @@
         <w:jc w:val="both"/>
         <w:rPr>
           <w:rFonts w:ascii="Times New Roman" w:hAnsi="Times New Roman" w:cs="Times New Roman"/>
-          <w:b/>
           <w:sz w:val="24"/>
           <w:szCs w:val="24"/>
         </w:rPr>
@@ -1237,35 +822,46 @@
           <w:sz w:val="24"/>
           <w:szCs w:val="24"/>
         </w:rPr>
-        <w:t>: Il épouse le</w:t>
-      </w:r>
-      <w:r>
-        <w:rPr>
-          <w:rFonts w:ascii="Times New Roman" w:hAnsi="Times New Roman" w:cs="Times New Roman"/>
-          <w:sz w:val="24"/>
-          <w:szCs w:val="24"/>
-        </w:rPr>
-        <w:t xml:space="preserve"> sommet de la ves</w:t>
-      </w:r>
-      <w:r>
-        <w:rPr>
-          <w:rFonts w:ascii="Times New Roman" w:hAnsi="Times New Roman" w:cs="Times New Roman"/>
-          <w:sz w:val="24"/>
-          <w:szCs w:val="24"/>
-        </w:rPr>
-        <w:t>sie</w:t>
-      </w:r>
-      <w:r>
-        <w:rPr>
-          <w:rFonts w:ascii="Times New Roman" w:hAnsi="Times New Roman" w:cs="Times New Roman"/>
-          <w:sz w:val="24"/>
-          <w:szCs w:val="24"/>
-        </w:rPr>
-        <w:t xml:space="preserve"> en formant le</w:t>
-      </w:r>
-      <w:r>
-        <w:rPr>
-          <w:rFonts w:ascii="Times New Roman" w:hAnsi="Times New Roman" w:cs="Times New Roman"/>
+        <w:t xml:space="preserve">: Il épouse le sommet de la vessie en formant le </w:t>
+      </w:r>
+      <w:r>
+        <w:rPr>
+          <w:rFonts w:ascii="Times New Roman" w:hAnsi="Times New Roman" w:cs="Times New Roman"/>
+          <w:i/>
+          <w:sz w:val="24"/>
+          <w:szCs w:val="24"/>
+        </w:rPr>
+        <w:t xml:space="preserve">cul-de sac vésico-utérin </w:t>
+      </w:r>
+      <w:r>
+        <w:rPr>
+          <w:rFonts w:ascii="Times New Roman" w:hAnsi="Times New Roman" w:cs="Times New Roman"/>
+          <w:sz w:val="24"/>
+          <w:szCs w:val="24"/>
+        </w:rPr>
+        <w:t xml:space="preserve">chez la femme ou </w:t>
+      </w:r>
+      <w:r>
+        <w:rPr>
+          <w:rFonts w:ascii="Times New Roman" w:hAnsi="Times New Roman" w:cs="Times New Roman"/>
+          <w:i/>
+          <w:sz w:val="24"/>
+          <w:szCs w:val="24"/>
+        </w:rPr>
+        <w:t>vésico-rectal</w:t>
+      </w:r>
+      <w:r>
+        <w:rPr>
+          <w:rFonts w:ascii="Times New Roman" w:hAnsi="Times New Roman" w:cs="Times New Roman"/>
+          <w:sz w:val="24"/>
+          <w:szCs w:val="24"/>
+        </w:rPr>
+        <w:t xml:space="preserve"> chez l’homme.</w:t>
+      </w:r>
+      <w:r>
+        <w:rPr>
+          <w:rFonts w:ascii="Times New Roman" w:hAnsi="Times New Roman" w:cs="Times New Roman"/>
+          <w:color w:val="FF0000"/>
           <w:sz w:val="24"/>
           <w:szCs w:val="24"/>
         </w:rPr>
@@ -1274,93 +870,10 @@
       <w:r>
         <w:rPr>
           <w:rFonts w:ascii="Times New Roman" w:hAnsi="Times New Roman" w:cs="Times New Roman"/>
-          <w:i/>
-          <w:sz w:val="24"/>
-          <w:szCs w:val="24"/>
-        </w:rPr>
-        <w:t xml:space="preserve">cul-de sac vésico-utérin </w:t>
-      </w:r>
-      <w:r>
-        <w:rPr>
-          <w:rFonts w:ascii="Times New Roman" w:hAnsi="Times New Roman" w:cs="Times New Roman"/>
-          <w:sz w:val="24"/>
-          <w:szCs w:val="24"/>
-        </w:rPr>
-        <w:t xml:space="preserve">chez la femme ou </w:t>
-      </w:r>
-      <w:r>
-        <w:rPr>
-          <w:rFonts w:ascii="Times New Roman" w:hAnsi="Times New Roman" w:cs="Times New Roman"/>
-          <w:i/>
-          <w:sz w:val="24"/>
-          <w:szCs w:val="24"/>
-        </w:rPr>
-        <w:t>vésico-rectal</w:t>
-      </w:r>
-      <w:r>
-        <w:rPr>
-          <w:rFonts w:ascii="Times New Roman" w:hAnsi="Times New Roman" w:cs="Times New Roman"/>
-          <w:sz w:val="24"/>
-          <w:szCs w:val="24"/>
-        </w:rPr>
-        <w:t xml:space="preserve"> chez l’homm</w:t>
-      </w:r>
-      <w:r>
-        <w:rPr>
-          <w:rFonts w:ascii="Times New Roman" w:hAnsi="Times New Roman" w:cs="Times New Roman"/>
-          <w:sz w:val="24"/>
-          <w:szCs w:val="24"/>
-        </w:rPr>
-        <w:t>e</w:t>
-      </w:r>
-      <w:r>
-        <w:rPr>
-          <w:rFonts w:ascii="Times New Roman" w:hAnsi="Times New Roman" w:cs="Times New Roman"/>
-          <w:sz w:val="24"/>
-          <w:szCs w:val="24"/>
-        </w:rPr>
-        <w:t>.</w:t>
-      </w:r>
-      <w:r>
-        <w:rPr>
-          <w:rFonts w:ascii="Times New Roman" w:hAnsi="Times New Roman" w:cs="Times New Roman"/>
-          <w:color w:val="FF0000"/>
-          <w:sz w:val="24"/>
-          <w:szCs w:val="24"/>
-        </w:rPr>
-        <w:t xml:space="preserve"> </w:t>
-      </w:r>
-      <w:r>
-        <w:rPr>
-          <w:rFonts w:ascii="Times New Roman" w:hAnsi="Times New Roman" w:cs="Times New Roman"/>
-          <w:sz w:val="24"/>
-          <w:szCs w:val="24"/>
-        </w:rPr>
-        <w:t>Les pto</w:t>
-      </w:r>
-      <w:r>
-        <w:rPr>
-          <w:rFonts w:ascii="Times New Roman" w:hAnsi="Times New Roman" w:cs="Times New Roman"/>
-          <w:sz w:val="24"/>
-          <w:szCs w:val="24"/>
-        </w:rPr>
-        <w:t>ses viscérales</w:t>
-      </w:r>
-      <w:r>
-        <w:rPr>
-          <w:rFonts w:ascii="Times New Roman" w:hAnsi="Times New Roman" w:cs="Times New Roman"/>
-          <w:sz w:val="24"/>
-          <w:szCs w:val="24"/>
-        </w:rPr>
-        <w:t xml:space="preserve"> de l’intestin grêle, la chirurgie abdominale, les infections, les spasmes viscéraux, retentissent sur le péritoine. Le glissement normal entre le péritoine et la vessie est freiné par les tensions du péritoine</w:t>
-      </w:r>
-      <w:r>
-        <w:rPr>
-          <w:rFonts w:ascii="Times New Roman" w:hAnsi="Times New Roman" w:cs="Times New Roman"/>
-          <w:sz w:val="24"/>
-          <w:szCs w:val="24"/>
-        </w:rPr>
-        <w:t>.</w:t>
+          <w:sz w:val="24"/>
+          <w:szCs w:val="24"/>
+        </w:rPr>
+        <w:t>Les ptoses viscérales de l’intestin grêle, la chirurgie abdominale, les infections, les spasmes viscéraux, retentissent sur le péritoine. Le glissement normal entre le péritoine et la vessie est freiné par les tensions du péritoine.</w:t>
       </w:r>
     </w:p>
     <w:p>
@@ -1376,6 +889,7 @@
         </w:rPr>
       </w:pPr>
       <w:r>
+        <w:lastRenderedPageBreak/>
         <w:t xml:space="preserve">Ligament ombilical médian et ligaments ombilico-prévésicaux : ils ont un rôle de suspenseur de la vessie comparable au ballon dans son filet : </w:t>
       </w:r>
     </w:p>
@@ -1415,11 +929,7 @@
       </w:r>
       <w:proofErr w:type="spellEnd"/>
       <w:r>
-        <w:t xml:space="preserve">-urétraux qui échangent des fibres avec le muscle détrusor de la vessie. Sa section par la </w:t>
-      </w:r>
-      <w:r>
-        <w:lastRenderedPageBreak/>
-        <w:t xml:space="preserve">chirurgie (césarienne) peut être une cause d’incontinence urinaire et d’éréthisme vésical. </w:t>
+        <w:t xml:space="preserve">-urétraux qui échangent des fibres avec le muscle détrusor de la vessie. Sa section par la chirurgie (césarienne) peut être une cause d’incontinence urinaire et d’éréthisme vésical. </w:t>
       </w:r>
     </w:p>
     <w:p>
@@ -1469,8 +979,9 @@
           <w:sz w:val="24"/>
           <w:szCs w:val="24"/>
         </w:rPr>
-        <w:t>pubo</w:t>
-      </w:r>
+        <w:t>pubovésicaux</w:t>
+      </w:r>
+      <w:proofErr w:type="spellEnd"/>
       <w:r>
         <w:rPr>
           <w:rFonts w:ascii="Times New Roman" w:hAnsi="Times New Roman" w:cs="Times New Roman"/>
@@ -1478,51 +989,43 @@
           <w:sz w:val="24"/>
           <w:szCs w:val="24"/>
         </w:rPr>
-        <w:t>vésicaux</w:t>
+        <w:t xml:space="preserve"> </w:t>
+      </w:r>
+      <w:r>
+        <w:rPr>
+          <w:rFonts w:ascii="Times New Roman" w:hAnsi="Times New Roman" w:cs="Times New Roman"/>
+          <w:sz w:val="24"/>
+          <w:szCs w:val="24"/>
+        </w:rPr>
+        <w:t xml:space="preserve">(chez la femme) et </w:t>
+      </w:r>
+      <w:proofErr w:type="spellStart"/>
+      <w:r>
+        <w:rPr>
+          <w:rFonts w:ascii="Times New Roman" w:hAnsi="Times New Roman" w:cs="Times New Roman"/>
+          <w:b/>
+          <w:sz w:val="24"/>
+          <w:szCs w:val="24"/>
+        </w:rPr>
+        <w:t>puboprostatiques</w:t>
       </w:r>
       <w:proofErr w:type="spellEnd"/>
       <w:r>
         <w:rPr>
           <w:rFonts w:ascii="Times New Roman" w:hAnsi="Times New Roman" w:cs="Times New Roman"/>
-          <w:b/>
-          <w:sz w:val="24"/>
-          <w:szCs w:val="24"/>
-        </w:rPr>
-        <w:t xml:space="preserve"> </w:t>
-      </w:r>
-      <w:r>
-        <w:rPr>
-          <w:rFonts w:ascii="Times New Roman" w:hAnsi="Times New Roman" w:cs="Times New Roman"/>
-          <w:sz w:val="24"/>
-          <w:szCs w:val="24"/>
-        </w:rPr>
-        <w:t>(chez la femme)</w:t>
-      </w:r>
-      <w:r>
-        <w:rPr>
-          <w:rFonts w:ascii="Times New Roman" w:hAnsi="Times New Roman" w:cs="Times New Roman"/>
-          <w:sz w:val="24"/>
-          <w:szCs w:val="24"/>
-        </w:rPr>
-        <w:t> </w:t>
-      </w:r>
-      <w:r>
-        <w:rPr>
-          <w:rFonts w:ascii="Times New Roman" w:hAnsi="Times New Roman" w:cs="Times New Roman"/>
-          <w:sz w:val="24"/>
-          <w:szCs w:val="24"/>
-        </w:rPr>
-        <w:t xml:space="preserve">et </w:t>
+          <w:sz w:val="24"/>
+          <w:szCs w:val="24"/>
+        </w:rPr>
+        <w:t xml:space="preserve"> (chez l’homme) : ils fixent la vessie au pubis. Leurs fibres sont en continuité avec le détrusor. La tension des ligaments crée un état d’</w:t>
       </w:r>
       <w:proofErr w:type="spellStart"/>
       <w:r>
         <w:rPr>
           <w:rFonts w:ascii="Times New Roman" w:hAnsi="Times New Roman" w:cs="Times New Roman"/>
-          <w:b/>
-          <w:sz w:val="24"/>
-          <w:szCs w:val="24"/>
-        </w:rPr>
-        <w:t>puboprostatiques</w:t>
+          <w:sz w:val="24"/>
+          <w:szCs w:val="24"/>
+        </w:rPr>
+        <w:t>hypercontractilité</w:t>
       </w:r>
       <w:proofErr w:type="spellEnd"/>
       <w:r>
@@ -1531,95 +1034,12 @@
           <w:sz w:val="24"/>
           <w:szCs w:val="24"/>
         </w:rPr>
-        <w:t xml:space="preserve"> (chez l’homme) </w:t>
-      </w:r>
-      <w:r>
-        <w:rPr>
-          <w:rFonts w:ascii="Times New Roman" w:hAnsi="Times New Roman" w:cs="Times New Roman"/>
-          <w:sz w:val="24"/>
-          <w:szCs w:val="24"/>
-        </w:rPr>
-        <w:t>: ils fixent la vessie au pubis. Leurs fibres sont en cont</w:t>
-      </w:r>
-      <w:r>
-        <w:rPr>
-          <w:rFonts w:ascii="Times New Roman" w:hAnsi="Times New Roman" w:cs="Times New Roman"/>
-          <w:sz w:val="24"/>
-          <w:szCs w:val="24"/>
-        </w:rPr>
-        <w:t>inuité avec le détrusor. L</w:t>
-      </w:r>
-      <w:r>
-        <w:rPr>
-          <w:rFonts w:ascii="Times New Roman" w:hAnsi="Times New Roman" w:cs="Times New Roman"/>
-          <w:sz w:val="24"/>
-          <w:szCs w:val="24"/>
-        </w:rPr>
-        <w:t>a tension</w:t>
-      </w:r>
-      <w:r>
-        <w:rPr>
-          <w:rFonts w:ascii="Times New Roman" w:hAnsi="Times New Roman" w:cs="Times New Roman"/>
-          <w:sz w:val="24"/>
-          <w:szCs w:val="24"/>
-        </w:rPr>
-        <w:t xml:space="preserve"> des ligaments crée un</w:t>
-      </w:r>
-      <w:r>
-        <w:rPr>
-          <w:rFonts w:ascii="Times New Roman" w:hAnsi="Times New Roman" w:cs="Times New Roman"/>
-          <w:sz w:val="24"/>
-          <w:szCs w:val="24"/>
-        </w:rPr>
-        <w:t xml:space="preserve"> état d’</w:t>
-      </w:r>
-      <w:proofErr w:type="spellStart"/>
-      <w:r>
-        <w:rPr>
-          <w:rFonts w:ascii="Times New Roman" w:hAnsi="Times New Roman" w:cs="Times New Roman"/>
-          <w:sz w:val="24"/>
-          <w:szCs w:val="24"/>
-        </w:rPr>
-        <w:t>hypercontractilité</w:t>
-      </w:r>
-      <w:proofErr w:type="spellEnd"/>
-      <w:r>
-        <w:rPr>
-          <w:rFonts w:ascii="Times New Roman" w:hAnsi="Times New Roman" w:cs="Times New Roman"/>
-          <w:sz w:val="24"/>
-          <w:szCs w:val="24"/>
-        </w:rPr>
-        <w:t xml:space="preserve"> (éré</w:t>
-      </w:r>
-      <w:r>
-        <w:rPr>
-          <w:rFonts w:ascii="Times New Roman" w:hAnsi="Times New Roman" w:cs="Times New Roman"/>
-          <w:sz w:val="24"/>
-          <w:szCs w:val="24"/>
-        </w:rPr>
-        <w:t>thisme) et le col vésical est dé</w:t>
-      </w:r>
-      <w:r>
-        <w:rPr>
-          <w:rFonts w:ascii="Times New Roman" w:hAnsi="Times New Roman" w:cs="Times New Roman"/>
-          <w:sz w:val="24"/>
-          <w:szCs w:val="24"/>
-        </w:rPr>
-        <w:t>stabilisé, avec</w:t>
-      </w:r>
-      <w:r>
-        <w:rPr>
-          <w:rFonts w:ascii="Times New Roman" w:hAnsi="Times New Roman" w:cs="Times New Roman"/>
-          <w:sz w:val="24"/>
-          <w:szCs w:val="24"/>
-        </w:rPr>
-        <w:t xml:space="preserve"> sensation de pesanteur dans le bas-ventre. </w:t>
-      </w:r>
-    </w:p>
-    <w:p>
-      <w:pPr>
-        <w:pStyle w:val="Heading3"/>
-        <w:keepNext/>
+        <w:t xml:space="preserve"> (éréthisme) et le col vésical est déstabilisé, avec sensation de pesanteur dans le bas-ventre. </w:t>
+      </w:r>
+    </w:p>
+    <w:p>
+      <w:pPr>
+        <w:pStyle w:val="Heading31"/>
         <w:numPr>
           <w:ilvl w:val="0"/>
           <w:numId w:val="8"/>
@@ -1665,52 +1085,7 @@
           <w:sz w:val="24"/>
           <w:szCs w:val="24"/>
         </w:rPr>
-        <w:t xml:space="preserve"> sacro-recto-cervico</w:t>
-      </w:r>
-      <w:r>
-        <w:rPr>
-          <w:rFonts w:ascii="Times New Roman" w:hAnsi="Times New Roman" w:cs="Times New Roman"/>
-          <w:b/>
-          <w:sz w:val="24"/>
-          <w:szCs w:val="24"/>
-        </w:rPr>
-        <w:t>-pubiennes</w:t>
-      </w:r>
-      <w:r>
-        <w:rPr>
-          <w:rFonts w:ascii="Times New Roman" w:hAnsi="Times New Roman" w:cs="Times New Roman"/>
-          <w:b/>
-          <w:sz w:val="24"/>
-          <w:szCs w:val="24"/>
-        </w:rPr>
-        <w:t xml:space="preserve"> (SR</w:t>
-      </w:r>
-      <w:r>
-        <w:rPr>
-          <w:rFonts w:ascii="Times New Roman" w:hAnsi="Times New Roman" w:cs="Times New Roman"/>
-          <w:b/>
-          <w:sz w:val="24"/>
-          <w:szCs w:val="24"/>
-        </w:rPr>
-        <w:t>G</w:t>
-      </w:r>
-      <w:r>
-        <w:rPr>
-          <w:rFonts w:ascii="Times New Roman" w:hAnsi="Times New Roman" w:cs="Times New Roman"/>
-          <w:b/>
-          <w:sz w:val="24"/>
-          <w:szCs w:val="24"/>
-        </w:rPr>
-        <w:t>C</w:t>
-      </w:r>
-      <w:r>
-        <w:rPr>
-          <w:rFonts w:ascii="Times New Roman" w:hAnsi="Times New Roman" w:cs="Times New Roman"/>
-          <w:b/>
-          <w:sz w:val="24"/>
-          <w:szCs w:val="24"/>
-        </w:rPr>
-        <w:t>P)</w:t>
+        <w:t xml:space="preserve"> sacro-recto-cervico-pubiennes (SRGCP)</w:t>
       </w:r>
     </w:p>
     <w:p>
@@ -1728,7 +1103,7 @@
         </w:rPr>
       </w:pPr>
       <w:r>
-        <w:t>Plexus veineux de Santorini : il est situé dans l’espace prévésical (entre le pubis et la vessie). La tonicité des veines maintient le col vésical en bonne place. Il est en relation avec les systèmes hémorroïdal et porto-cave (figure 11.7). Tout trouble fonctionnel du système porte se répercute sur le plexus veineux de Santorini. Le relâchement du système musculo-ligamentaire vésical déstabilise le plexus veineux de Santorini favorisant une incontinence urinaire.</w:t>
+        <w:t>Plexus veineux de Santorini : il est situé dans l’espace prévésical (entre le pubis et la vessie). La tonicité des veines maintient le col vésical en bonne place. Il est en relation avec les systèmes hémorroïdal et porto-cave. Tout trouble fonctionnel du système porte se répercute sur le plexus veineux de Santorini. Le relâchement du système musculo-ligamentaire vésical déstabilise le plexus veineux de Santorini favorisant une incontinence urinaire.</w:t>
       </w:r>
     </w:p>
     <w:p>
@@ -1751,16 +1126,7 @@
           <w:sz w:val="24"/>
           <w:szCs w:val="24"/>
         </w:rPr>
-        <w:t xml:space="preserve">Plancher pelvien du </w:t>
-      </w:r>
-      <w:r>
-        <w:rPr>
-          <w:rFonts w:ascii="Times New Roman" w:hAnsi="Times New Roman" w:cs="Times New Roman"/>
-          <w:b/>
-          <w:sz w:val="24"/>
-          <w:szCs w:val="24"/>
-        </w:rPr>
-        <w:t>périnée</w:t>
+        <w:t>Plancher pelvien du périnée</w:t>
       </w:r>
       <w:r>
         <w:rPr>
@@ -1816,39 +1182,7 @@
           <w:sz w:val="24"/>
           <w:szCs w:val="24"/>
         </w:rPr>
-        <w:t xml:space="preserve"> Il y a un continuum anatomique entre l</w:t>
-      </w:r>
-      <w:r>
-        <w:rPr>
-          <w:rFonts w:ascii="Times New Roman" w:hAnsi="Times New Roman" w:cs="Times New Roman"/>
-          <w:sz w:val="24"/>
-          <w:szCs w:val="24"/>
-        </w:rPr>
-        <w:t>e diaphragme, le foie, la cavité pelvienne</w:t>
-      </w:r>
-      <w:r>
-        <w:rPr>
-          <w:rFonts w:ascii="Times New Roman" w:hAnsi="Times New Roman" w:cs="Times New Roman"/>
-          <w:sz w:val="24"/>
-          <w:szCs w:val="24"/>
-        </w:rPr>
-        <w:t>, la vessie et les hanches. Le bon fonctionnement de la vessie repose sur ses liens avec le pér</w:t>
-      </w:r>
-      <w:r>
-        <w:rPr>
-          <w:rFonts w:ascii="Times New Roman" w:hAnsi="Times New Roman" w:cs="Times New Roman"/>
-          <w:sz w:val="24"/>
-          <w:szCs w:val="24"/>
-        </w:rPr>
-        <w:t xml:space="preserve">itoine, la symphyse pubienne, </w:t>
-      </w:r>
-      <w:r>
-        <w:rPr>
-          <w:rFonts w:ascii="Times New Roman" w:hAnsi="Times New Roman" w:cs="Times New Roman"/>
-          <w:sz w:val="24"/>
-          <w:szCs w:val="24"/>
-        </w:rPr>
-        <w:t xml:space="preserve">les ligaments </w:t>
+        <w:t xml:space="preserve"> Il y a un continuum anatomique entre le diaphragme, le foie, la cavité pelvienne, la vessie et les hanches. Le bon fonctionnement de la vessie repose sur ses liens avec le péritoine, la symphyse pubienne, les ligaments </w:t>
       </w:r>
       <w:proofErr w:type="spellStart"/>
       <w:r>
@@ -1890,7 +1224,6 @@
     <w:p>
       <w:pPr>
         <w:pStyle w:val="Heading1"/>
-        <w:keepNext/>
         <w:spacing w:before="160" w:after="60"/>
         <w:rPr>
           <w:color w:val="auto"/>
@@ -1904,7 +1237,6 @@
     <w:p>
       <w:pPr>
         <w:pStyle w:val="Heading2"/>
-        <w:keepNext/>
         <w:numPr>
           <w:ilvl w:val="0"/>
           <w:numId w:val="21"/>
@@ -1912,7 +1244,6 @@
         <w:spacing w:before="100" w:after="60"/>
         <w:rPr>
           <w:rFonts w:ascii="Times New Roman" w:hAnsi="Times New Roman" w:cs="Times New Roman"/>
-          <w:sz w:val="24"/>
           <w:szCs w:val="24"/>
         </w:rPr>
       </w:pPr>
@@ -2008,15 +1339,7 @@
           <w:sz w:val="24"/>
           <w:szCs w:val="24"/>
         </w:rPr>
-        <w:t xml:space="preserve"> : le péritoine</w:t>
-      </w:r>
-      <w:r>
-        <w:rPr>
-          <w:rFonts w:ascii="Times New Roman" w:hAnsi="Times New Roman" w:cs="Times New Roman"/>
-          <w:sz w:val="24"/>
-          <w:szCs w:val="24"/>
-        </w:rPr>
-        <w:t> ;</w:t>
+        <w:t xml:space="preserve"> : le péritoine ;</w:t>
       </w:r>
     </w:p>
     <w:p>
@@ -2058,15 +1381,7 @@
           <w:sz w:val="24"/>
           <w:szCs w:val="24"/>
         </w:rPr>
-        <w:t xml:space="preserve"> : le corps de l’utérus</w:t>
-      </w:r>
-      <w:r>
-        <w:rPr>
-          <w:rFonts w:ascii="Times New Roman" w:hAnsi="Times New Roman" w:cs="Times New Roman"/>
-          <w:sz w:val="24"/>
-          <w:szCs w:val="24"/>
-        </w:rPr>
-        <w:t> ;</w:t>
+        <w:t xml:space="preserve"> : le corps de l’utérus ;</w:t>
       </w:r>
     </w:p>
     <w:p>
@@ -2097,15 +1412,7 @@
           <w:sz w:val="24"/>
           <w:szCs w:val="24"/>
         </w:rPr>
-        <w:t> : le col de l’utérus et le vagin</w:t>
-      </w:r>
-      <w:r>
-        <w:rPr>
-          <w:rFonts w:ascii="Times New Roman" w:hAnsi="Times New Roman" w:cs="Times New Roman"/>
-          <w:sz w:val="24"/>
-          <w:szCs w:val="24"/>
-        </w:rPr>
-        <w:t> ;</w:t>
+        <w:t> : le col de l’utérus et le vagin ;</w:t>
       </w:r>
     </w:p>
     <w:p>
@@ -2167,7 +1474,6 @@
     <w:p>
       <w:pPr>
         <w:pStyle w:val="Heading2"/>
-        <w:keepNext/>
         <w:numPr>
           <w:ilvl w:val="0"/>
           <w:numId w:val="21"/>
@@ -2175,7 +1481,6 @@
         <w:spacing w:before="100" w:after="60"/>
         <w:rPr>
           <w:rFonts w:ascii="Times New Roman" w:hAnsi="Times New Roman" w:cs="Times New Roman"/>
-          <w:sz w:val="24"/>
           <w:szCs w:val="24"/>
         </w:rPr>
       </w:pPr>
@@ -2268,15 +1573,7 @@
           <w:sz w:val="24"/>
           <w:szCs w:val="24"/>
         </w:rPr>
-        <w:t xml:space="preserve"> : l’aponévrose prostato-péritonéale</w:t>
-      </w:r>
-      <w:r>
-        <w:rPr>
-          <w:rFonts w:ascii="Times New Roman" w:hAnsi="Times New Roman" w:cs="Times New Roman"/>
-          <w:sz w:val="24"/>
-          <w:szCs w:val="24"/>
-        </w:rPr>
-        <w:t xml:space="preserve"> de </w:t>
+        <w:t xml:space="preserve"> : l’aponévrose prostato-péritonéale de </w:t>
       </w:r>
       <w:proofErr w:type="spellStart"/>
       <w:r>
@@ -2317,6 +1614,7 @@
           <w:sz w:val="24"/>
           <w:szCs w:val="24"/>
         </w:rPr>
+        <w:lastRenderedPageBreak/>
         <w:t>Caudalement</w:t>
       </w:r>
       <w:r>
@@ -2325,15 +1623,7 @@
           <w:sz w:val="24"/>
           <w:szCs w:val="24"/>
         </w:rPr>
-        <w:t> : la prostate</w:t>
-      </w:r>
-      <w:r>
-        <w:rPr>
-          <w:rFonts w:ascii="Times New Roman" w:hAnsi="Times New Roman" w:cs="Times New Roman"/>
-          <w:sz w:val="24"/>
-          <w:szCs w:val="24"/>
-        </w:rPr>
-        <w:t> ;</w:t>
+        <w:t> : la prostate ;</w:t>
       </w:r>
     </w:p>
     <w:p>
@@ -2364,37 +1654,12 @@
           <w:sz w:val="24"/>
           <w:szCs w:val="24"/>
         </w:rPr>
-        <w:t xml:space="preserve"> : </w:t>
-      </w:r>
-      <w:r>
-        <w:rPr>
-          <w:rFonts w:ascii="Times New Roman" w:hAnsi="Times New Roman" w:cs="Times New Roman"/>
-          <w:sz w:val="24"/>
-          <w:szCs w:val="24"/>
-        </w:rPr>
-        <w:t xml:space="preserve">les </w:t>
-      </w:r>
-      <w:r>
-        <w:rPr>
-          <w:rFonts w:ascii="Times New Roman" w:hAnsi="Times New Roman" w:cs="Times New Roman"/>
-          <w:sz w:val="24"/>
-          <w:szCs w:val="24"/>
-        </w:rPr>
-        <w:t>muscles obturateurs</w:t>
-      </w:r>
-      <w:r>
-        <w:rPr>
-          <w:rFonts w:ascii="Times New Roman" w:hAnsi="Times New Roman" w:cs="Times New Roman"/>
-          <w:sz w:val="24"/>
-          <w:szCs w:val="24"/>
-        </w:rPr>
-        <w:t xml:space="preserve"> internes et releveur de l’anus.</w:t>
+        <w:t xml:space="preserve"> : les muscles obturateurs internes et releveur de l’anus.</w:t>
       </w:r>
     </w:p>
     <w:p>
       <w:pPr>
         <w:pStyle w:val="Heading1"/>
-        <w:keepNext/>
         <w:spacing w:before="160" w:after="60"/>
         <w:rPr>
           <w:color w:val="auto"/>
@@ -2407,7 +1672,6 @@
     <w:p>
       <w:pPr>
         <w:pStyle w:val="Heading2"/>
-        <w:keepNext/>
         <w:spacing w:before="100" w:after="60"/>
       </w:pPr>
       <w:r>
@@ -2428,8 +1692,6 @@
           <w:szCs w:val="24"/>
         </w:rPr>
       </w:pPr>
-      <w:proofErr w:type="gramStart"/>
-      <w:proofErr w:type="gramEnd"/>
       <w:r>
         <w:t>les branches de l’artère iliaque interne ;</w:t>
       </w:r>
@@ -2437,7 +1699,6 @@
     <w:p>
       <w:pPr>
         <w:pStyle w:val="Heading2"/>
-        <w:keepNext/>
         <w:spacing w:before="100" w:after="60"/>
       </w:pPr>
       <w:r>
@@ -2458,10 +1719,6 @@
           <w:szCs w:val="24"/>
         </w:rPr>
       </w:pPr>
-      <w:proofErr w:type="gramStart"/>
-      <w:proofErr w:type="gramEnd"/>
-      <w:proofErr w:type="spellStart"/>
-      <w:proofErr w:type="spellEnd"/>
       <w:r>
         <w:t>les branches de la veine iliaque interne. Le plexus veineux de Santorini appartient au système porte.</w:t>
       </w:r>
@@ -2469,7 +1726,6 @@
     <w:p>
       <w:pPr>
         <w:pStyle w:val="Heading1"/>
-        <w:keepNext/>
         <w:spacing w:before="160" w:after="60"/>
         <w:rPr>
           <w:color w:val="auto"/>
@@ -2482,7 +1738,6 @@
     <w:p>
       <w:pPr>
         <w:pStyle w:val="Heading2"/>
-        <w:keepNext/>
         <w:spacing w:before="100" w:after="60"/>
       </w:pPr>
       <w:r>
@@ -2504,10 +1759,6 @@
           <w:lang w:val="en-US"/>
         </w:rPr>
       </w:pPr>
-      <w:proofErr w:type="spellStart"/>
-      <w:proofErr w:type="gramStart"/>
-      <w:proofErr w:type="spellEnd"/>
-      <w:proofErr w:type="gramEnd"/>
       <w:r>
         <w:t>nerf pudendal S2 à S4</w:t>
       </w:r>
@@ -2515,7 +1766,6 @@
     <w:p>
       <w:pPr>
         <w:pStyle w:val="Heading2"/>
-        <w:keepNext/>
         <w:numPr>
           <w:ilvl w:val="0"/>
           <w:numId w:val="16"/>
@@ -2524,7 +1774,6 @@
         <w:jc w:val="both"/>
         <w:rPr>
           <w:rFonts w:ascii="Times New Roman" w:hAnsi="Times New Roman" w:cs="Times New Roman"/>
-          <w:sz w:val="24"/>
           <w:szCs w:val="24"/>
         </w:rPr>
       </w:pPr>
@@ -2561,111 +1810,7 @@
           <w:sz w:val="24"/>
           <w:szCs w:val="24"/>
         </w:rPr>
-        <w:t xml:space="preserve"> : </w:t>
-      </w:r>
-      <w:r>
-        <w:rPr>
-          <w:rFonts w:ascii="Times New Roman" w:hAnsi="Times New Roman" w:cs="Times New Roman"/>
-          <w:sz w:val="24"/>
-          <w:szCs w:val="24"/>
-        </w:rPr>
-        <w:t>son origine médullaire va de T</w:t>
-      </w:r>
-      <w:r>
-        <w:rPr>
-          <w:rFonts w:ascii="Times New Roman" w:hAnsi="Times New Roman" w:cs="Times New Roman"/>
-          <w:sz w:val="24"/>
-          <w:szCs w:val="24"/>
-        </w:rPr>
-        <w:t>h</w:t>
-      </w:r>
-      <w:r>
-        <w:rPr>
-          <w:rFonts w:ascii="Times New Roman" w:hAnsi="Times New Roman" w:cs="Times New Roman"/>
-          <w:sz w:val="24"/>
-          <w:szCs w:val="24"/>
-        </w:rPr>
-        <w:t>11 à L2 (hauteur ve</w:t>
-      </w:r>
-      <w:r>
-        <w:rPr>
-          <w:rFonts w:ascii="Times New Roman" w:hAnsi="Times New Roman" w:cs="Times New Roman"/>
-          <w:sz w:val="24"/>
-          <w:szCs w:val="24"/>
-        </w:rPr>
-        <w:t>rtébrale T</w:t>
-      </w:r>
-      <w:r>
-        <w:rPr>
-          <w:rFonts w:ascii="Times New Roman" w:hAnsi="Times New Roman" w:cs="Times New Roman"/>
-          <w:sz w:val="24"/>
-          <w:szCs w:val="24"/>
-        </w:rPr>
-        <w:t>h</w:t>
-      </w:r>
-      <w:r>
-        <w:rPr>
-          <w:rFonts w:ascii="Times New Roman" w:hAnsi="Times New Roman" w:cs="Times New Roman"/>
-          <w:sz w:val="24"/>
-          <w:szCs w:val="24"/>
-        </w:rPr>
-        <w:t>11-T</w:t>
-      </w:r>
-      <w:r>
-        <w:rPr>
-          <w:rFonts w:ascii="Times New Roman" w:hAnsi="Times New Roman" w:cs="Times New Roman"/>
-          <w:sz w:val="24"/>
-          <w:szCs w:val="24"/>
-        </w:rPr>
-        <w:t>h12), la</w:t>
-      </w:r>
-      <w:r>
-        <w:rPr>
-          <w:rFonts w:ascii="Times New Roman" w:hAnsi="Times New Roman" w:cs="Times New Roman"/>
-          <w:sz w:val="24"/>
-          <w:szCs w:val="24"/>
-        </w:rPr>
-        <w:t xml:space="preserve"> chaîne ganglionnaire lombo-sacrale</w:t>
-      </w:r>
-      <w:r>
-        <w:rPr>
-          <w:rFonts w:ascii="Times New Roman" w:hAnsi="Times New Roman" w:cs="Times New Roman"/>
-          <w:sz w:val="24"/>
-          <w:szCs w:val="24"/>
-        </w:rPr>
-        <w:t xml:space="preserve"> et</w:t>
-      </w:r>
-      <w:r>
-        <w:rPr>
-          <w:rFonts w:ascii="Times New Roman" w:hAnsi="Times New Roman" w:cs="Times New Roman"/>
-          <w:sz w:val="24"/>
-          <w:szCs w:val="24"/>
-        </w:rPr>
-        <w:t xml:space="preserve"> le </w:t>
-      </w:r>
-      <w:r>
-        <w:rPr>
-          <w:rFonts w:ascii="Times New Roman" w:hAnsi="Times New Roman" w:cs="Times New Roman"/>
-          <w:sz w:val="24"/>
-          <w:szCs w:val="24"/>
-        </w:rPr>
-        <w:t>ganglion impair</w:t>
-      </w:r>
-      <w:r>
-        <w:rPr>
-          <w:rFonts w:ascii="Times New Roman" w:hAnsi="Times New Roman" w:cs="Times New Roman"/>
-          <w:sz w:val="24"/>
-          <w:szCs w:val="24"/>
-        </w:rPr>
-        <w:t>.</w:t>
-      </w:r>
-      <w:r>
-        <w:rPr>
-          <w:rFonts w:ascii="Times New Roman" w:hAnsi="Times New Roman" w:cs="Times New Roman"/>
-          <w:sz w:val="24"/>
-          <w:szCs w:val="24"/>
-        </w:rPr>
-        <w:t xml:space="preserve"> </w:t>
+        <w:t xml:space="preserve"> : son origine médullaire va de Th11 à L2 (hauteur vertébrale Th11-Th12), la chaîne ganglionnaire lombo-sacrale et le ganglion impair. </w:t>
       </w:r>
     </w:p>
     <w:p>
@@ -2697,55 +1842,7 @@
           <w:sz w:val="24"/>
           <w:szCs w:val="24"/>
         </w:rPr>
-        <w:t xml:space="preserve"> : </w:t>
-      </w:r>
-      <w:r>
-        <w:rPr>
-          <w:rFonts w:ascii="Times New Roman" w:hAnsi="Times New Roman" w:cs="Times New Roman"/>
-          <w:sz w:val="24"/>
-          <w:szCs w:val="24"/>
-        </w:rPr>
-        <w:t xml:space="preserve">son origine est la </w:t>
-      </w:r>
-      <w:r>
-        <w:rPr>
-          <w:rFonts w:ascii="Times New Roman" w:hAnsi="Times New Roman" w:cs="Times New Roman"/>
-          <w:sz w:val="24"/>
-          <w:szCs w:val="24"/>
-        </w:rPr>
-        <w:t>moelle sacré</w:t>
-      </w:r>
-      <w:r>
-        <w:rPr>
-          <w:rFonts w:ascii="Times New Roman" w:hAnsi="Times New Roman" w:cs="Times New Roman"/>
-          <w:sz w:val="24"/>
-          <w:szCs w:val="24"/>
-        </w:rPr>
-        <w:t>e S2 à S4 (hauteur vertébrale L1). Les fibres sortent des trous sacrés antérieurs avec les branches antérieures du nerf pudendal pour former</w:t>
-      </w:r>
-      <w:r>
-        <w:rPr>
-          <w:rFonts w:ascii="Times New Roman" w:hAnsi="Times New Roman" w:cs="Times New Roman"/>
-          <w:sz w:val="24"/>
-          <w:szCs w:val="24"/>
-        </w:rPr>
-        <w:t xml:space="preserve"> le nerf érecteur d’Eckard</w:t>
-      </w:r>
-      <w:r>
-        <w:rPr>
-          <w:rFonts w:ascii="Times New Roman" w:hAnsi="Times New Roman" w:cs="Times New Roman"/>
-          <w:sz w:val="24"/>
-          <w:szCs w:val="24"/>
-        </w:rPr>
-        <w:t>t</w:t>
-      </w:r>
-      <w:r>
-        <w:rPr>
-          <w:rFonts w:ascii="Times New Roman" w:hAnsi="Times New Roman" w:cs="Times New Roman"/>
-          <w:sz w:val="24"/>
-          <w:szCs w:val="24"/>
-        </w:rPr>
-        <w:t>.</w:t>
+        <w:t> : son origine est la moelle sacrée S2 à S4 (hauteur vertébrale L1). Les fibres sortent des trous sacrés antérieurs avec les branches antérieures du nerf pudendal pour former le nerf érecteur d’Eckardt.</w:t>
       </w:r>
     </w:p>
     <w:p>
@@ -2768,23 +1865,7 @@
           <w:sz w:val="24"/>
           <w:szCs w:val="24"/>
         </w:rPr>
-        <w:t>Les fibres sympathiques et parasympathiques aboutissent dans le plexus hypogastrique inférieur situé dans la lame sacro</w:t>
-      </w:r>
-      <w:r>
-        <w:rPr>
-          <w:rFonts w:ascii="Times New Roman" w:hAnsi="Times New Roman" w:cs="Times New Roman"/>
-          <w:sz w:val="24"/>
-          <w:szCs w:val="24"/>
-        </w:rPr>
-        <w:t>-</w:t>
-      </w:r>
-      <w:r>
-        <w:rPr>
-          <w:rFonts w:ascii="Times New Roman" w:hAnsi="Times New Roman" w:cs="Times New Roman"/>
-          <w:sz w:val="24"/>
-          <w:szCs w:val="24"/>
-        </w:rPr>
-        <w:t>recto-</w:t>
+        <w:t>Les fibres sympathiques et parasympathiques aboutissent dans le plexus hypogastrique inférieur situé dans la lame sacro-recto-</w:t>
       </w:r>
       <w:proofErr w:type="spellStart"/>
       <w:r>
@@ -2802,29 +1883,12 @@
           <w:sz w:val="24"/>
           <w:szCs w:val="24"/>
         </w:rPr>
-        <w:t>-</w:t>
-      </w:r>
-      <w:r>
-        <w:rPr>
-          <w:rFonts w:ascii="Times New Roman" w:hAnsi="Times New Roman" w:cs="Times New Roman"/>
-          <w:sz w:val="24"/>
-          <w:szCs w:val="24"/>
-        </w:rPr>
-        <w:t>cervico-</w:t>
-      </w:r>
-      <w:r>
-        <w:rPr>
-          <w:rFonts w:ascii="Times New Roman" w:hAnsi="Times New Roman" w:cs="Times New Roman"/>
-          <w:sz w:val="24"/>
-          <w:szCs w:val="24"/>
-        </w:rPr>
-        <w:t>pubienne.</w:t>
+        <w:t>-cervico-pubienne.</w:t>
       </w:r>
     </w:p>
     <w:p>
       <w:pPr>
         <w:pStyle w:val="Heading2"/>
-        <w:keepNext/>
         <w:spacing w:before="100" w:after="60"/>
       </w:pPr>
       <w:r>
@@ -2852,7 +1916,6 @@
     <w:p>
       <w:pPr>
         <w:pStyle w:val="Heading2"/>
-        <w:keepNext/>
         <w:spacing w:before="100" w:after="60"/>
       </w:pPr>
       <w:r>
@@ -2880,7 +1943,6 @@
     <w:p>
       <w:pPr>
         <w:pStyle w:val="Heading1"/>
-        <w:keepNext/>
         <w:spacing w:before="160" w:after="60"/>
         <w:rPr>
           <w:highlight w:val="yellow"/>
@@ -2893,7 +1955,6 @@
     <w:p>
       <w:pPr>
         <w:pStyle w:val="Heading2"/>
-        <w:keepNext/>
         <w:spacing w:before="100" w:after="60"/>
       </w:pPr>
       <w:r>
@@ -2968,15 +2029,7 @@
           <w:sz w:val="24"/>
           <w:szCs w:val="24"/>
         </w:rPr>
-        <w:t>relâchement du détrusor</w:t>
-      </w:r>
-      <w:r>
-        <w:rPr>
-          <w:rFonts w:ascii="Times New Roman" w:hAnsi="Times New Roman" w:cs="Times New Roman"/>
-          <w:sz w:val="24"/>
-          <w:szCs w:val="24"/>
-        </w:rPr>
-        <w:t> ;</w:t>
+        <w:t>relâchement du détrusor ;</w:t>
       </w:r>
     </w:p>
     <w:p>
@@ -3000,15 +2053,7 @@
           <w:sz w:val="24"/>
           <w:szCs w:val="24"/>
         </w:rPr>
-        <w:t>contraction du sphincter lisse</w:t>
-      </w:r>
-      <w:r>
-        <w:rPr>
-          <w:rFonts w:ascii="Times New Roman" w:hAnsi="Times New Roman" w:cs="Times New Roman"/>
-          <w:sz w:val="24"/>
-          <w:szCs w:val="24"/>
-        </w:rPr>
-        <w:t> ;</w:t>
+        <w:t>contraction du sphincter lisse ;</w:t>
       </w:r>
     </w:p>
     <w:p>
@@ -3032,32 +2077,16 @@
           <w:sz w:val="24"/>
           <w:szCs w:val="24"/>
         </w:rPr>
-        <w:t>contraction du s</w:t>
-      </w:r>
-      <w:r>
-        <w:rPr>
-          <w:rFonts w:ascii="Times New Roman" w:hAnsi="Times New Roman" w:cs="Times New Roman"/>
-          <w:sz w:val="24"/>
-          <w:szCs w:val="24"/>
-        </w:rPr>
-        <w:t>phincter strié (apprentissage à</w:t>
-      </w:r>
-      <w:r>
-        <w:rPr>
-          <w:rFonts w:ascii="Times New Roman" w:hAnsi="Times New Roman" w:cs="Times New Roman"/>
-          <w:sz w:val="24"/>
-          <w:szCs w:val="24"/>
-        </w:rPr>
-        <w:t xml:space="preserve"> la propreté).</w:t>
+        <w:t>contraction du sphincter strié (apprentissage à la propreté).</w:t>
       </w:r>
     </w:p>
     <w:p>
       <w:pPr>
         <w:pStyle w:val="Heading2"/>
-        <w:keepNext/>
         <w:spacing w:before="100" w:after="60"/>
       </w:pPr>
       <w:r>
+        <w:lastRenderedPageBreak/>
         <w:t>7.2. Occlusion cervico-urétrale</w:t>
       </w:r>
     </w:p>
@@ -3098,7 +2127,6 @@
     <w:p>
       <w:pPr>
         <w:pStyle w:val="Heading2"/>
-        <w:keepNext/>
         <w:spacing w:before="100" w:after="60"/>
       </w:pPr>
       <w:r>
@@ -3116,10 +2144,6 @@
           <w:szCs w:val="24"/>
         </w:rPr>
       </w:pPr>
-      <w:proofErr w:type="spellStart"/>
-      <w:proofErr w:type="spellEnd"/>
-      <w:proofErr w:type="spellStart"/>
-      <w:proofErr w:type="spellEnd"/>
       <w:r>
         <w:t>le système musculaire occlusif – muscles pubo-vésical, pubo-coccygien, élévateur de l’anus, transverse profond - a un rôle faible dans la continence au repos mais réel lors des efforts physiques, la toux, les éternuements.</w:t>
       </w:r>
@@ -3127,7 +2151,6 @@
     <w:p>
       <w:pPr>
         <w:pStyle w:val="Heading2"/>
-        <w:keepNext/>
         <w:spacing w:before="100" w:after="60"/>
       </w:pPr>
       <w:r>
@@ -3155,7 +2178,6 @@
     <w:p>
       <w:pPr>
         <w:pStyle w:val="Heading2"/>
-        <w:keepNext/>
         <w:spacing w:before="100" w:after="60"/>
       </w:pPr>
       <w:r>
@@ -3198,7 +2220,6 @@
           <w:sz w:val="24"/>
           <w:szCs w:val="24"/>
         </w:rPr>
-        <w:lastRenderedPageBreak/>
         <w:t>La phase de miction est de type parasympathique</w:t>
       </w:r>
       <w:r>
@@ -3276,29 +2297,12 @@
           <w:sz w:val="24"/>
           <w:szCs w:val="24"/>
         </w:rPr>
-        <w:t>relâchement</w:t>
-      </w:r>
-      <w:r>
-        <w:rPr>
-          <w:rFonts w:ascii="Times New Roman" w:hAnsi="Times New Roman" w:cs="Times New Roman"/>
-          <w:sz w:val="24"/>
-          <w:szCs w:val="24"/>
-        </w:rPr>
-        <w:t xml:space="preserve"> actif</w:t>
-      </w:r>
-      <w:r>
-        <w:rPr>
-          <w:rFonts w:ascii="Times New Roman" w:hAnsi="Times New Roman" w:cs="Times New Roman"/>
-          <w:sz w:val="24"/>
-          <w:szCs w:val="24"/>
-        </w:rPr>
-        <w:t xml:space="preserve"> du sphincter strié</w:t>
+        <w:t>relâchement actif du sphincter strié</w:t>
       </w:r>
     </w:p>
     <w:p>
       <w:pPr>
         <w:pStyle w:val="Heading2"/>
-        <w:keepNext/>
         <w:spacing w:before="100" w:after="60"/>
       </w:pPr>
       <w:r>
@@ -3340,39 +2344,7 @@
           <w:sz w:val="24"/>
           <w:szCs w:val="24"/>
         </w:rPr>
-        <w:t>Par l’éducation, le cortex cérébral contrôle l’activité vésicale. Si le système limbique, siège des émotions et de la peur, prend le pas sur le cortex</w:t>
-      </w:r>
-      <w:r>
-        <w:rPr>
-          <w:rFonts w:ascii="Times New Roman" w:hAnsi="Times New Roman" w:cs="Times New Roman"/>
-          <w:sz w:val="24"/>
-          <w:szCs w:val="24"/>
-        </w:rPr>
-        <w:t>,</w:t>
-      </w:r>
-      <w:r>
-        <w:rPr>
-          <w:rFonts w:ascii="Times New Roman" w:hAnsi="Times New Roman" w:cs="Times New Roman"/>
-          <w:sz w:val="24"/>
-          <w:szCs w:val="24"/>
-        </w:rPr>
-        <w:t xml:space="preserve"> il modifie le contrôle neuro-musculaire de la vessie d’où envies impér</w:t>
-      </w:r>
-      <w:r>
-        <w:rPr>
-          <w:rFonts w:ascii="Times New Roman" w:hAnsi="Times New Roman" w:cs="Times New Roman"/>
-          <w:sz w:val="24"/>
-          <w:szCs w:val="24"/>
-        </w:rPr>
-        <w:t>ieuses, pollakiurie, énurésie</w:t>
-      </w:r>
-      <w:r>
-        <w:rPr>
-          <w:rFonts w:ascii="Times New Roman" w:hAnsi="Times New Roman" w:cs="Times New Roman"/>
-          <w:sz w:val="24"/>
-          <w:szCs w:val="24"/>
-        </w:rPr>
-        <w:t xml:space="preserve">. </w:t>
+        <w:t xml:space="preserve">Par l’éducation, le cortex cérébral contrôle l’activité vésicale. Si le système limbique, siège des émotions et de la peur, prend le pas sur le cortex, il modifie le contrôle neuro-musculaire de la vessie d’où envies impérieuses, pollakiurie, énurésie. </w:t>
       </w:r>
     </w:p>
     <w:p>
@@ -3413,7 +2385,6 @@
     <w:p>
       <w:pPr>
         <w:pStyle w:val="Heading2"/>
-        <w:keepNext/>
         <w:spacing w:before="100" w:after="60"/>
       </w:pPr>
       <w:r>
@@ -3465,10 +2436,10 @@
     <w:p>
       <w:pPr>
         <w:pStyle w:val="Heading2"/>
-        <w:keepNext/>
         <w:spacing w:before="100" w:after="60"/>
       </w:pPr>
       <w:r>
+        <w:lastRenderedPageBreak/>
         <w:t>7.7. Enceinte manométrique pelvienne</w:t>
       </w:r>
     </w:p>
@@ -3517,119 +2488,7 @@
           <w:sz w:val="24"/>
           <w:szCs w:val="24"/>
         </w:rPr>
-        <w:t> : le renforcement</w:t>
-      </w:r>
-      <w:r>
-        <w:rPr>
-          <w:rFonts w:ascii="Times New Roman" w:hAnsi="Times New Roman" w:cs="Times New Roman"/>
-          <w:sz w:val="24"/>
-          <w:szCs w:val="24"/>
-        </w:rPr>
-        <w:t xml:space="preserve"> trop précoce </w:t>
-      </w:r>
-      <w:r>
-        <w:rPr>
-          <w:rFonts w:ascii="Times New Roman" w:hAnsi="Times New Roman" w:cs="Times New Roman"/>
-          <w:sz w:val="24"/>
-          <w:szCs w:val="24"/>
-        </w:rPr>
-        <w:t>des muscles abdominaux</w:t>
-      </w:r>
-      <w:r>
-        <w:rPr>
-          <w:rFonts w:ascii="Times New Roman" w:hAnsi="Times New Roman" w:cs="Times New Roman"/>
-          <w:sz w:val="24"/>
-          <w:szCs w:val="24"/>
-        </w:rPr>
-        <w:t xml:space="preserve"> chez la femme dans le post-partum,</w:t>
-      </w:r>
-      <w:r>
-        <w:rPr>
-          <w:rFonts w:ascii="Times New Roman" w:hAnsi="Times New Roman" w:cs="Times New Roman"/>
-          <w:sz w:val="24"/>
-          <w:szCs w:val="24"/>
-        </w:rPr>
-        <w:t xml:space="preserve"> aggrave cette incontinence. Il fa</w:t>
-      </w:r>
-      <w:r>
-        <w:rPr>
-          <w:rFonts w:ascii="Times New Roman" w:hAnsi="Times New Roman" w:cs="Times New Roman"/>
-          <w:sz w:val="24"/>
-          <w:szCs w:val="24"/>
-        </w:rPr>
-        <w:t>ut</w:t>
-      </w:r>
-      <w:r>
-        <w:rPr>
-          <w:rFonts w:ascii="Times New Roman" w:hAnsi="Times New Roman" w:cs="Times New Roman"/>
-          <w:sz w:val="24"/>
-          <w:szCs w:val="24"/>
-        </w:rPr>
-        <w:t xml:space="preserve"> d’abord</w:t>
-      </w:r>
-      <w:r>
-        <w:rPr>
-          <w:rFonts w:ascii="Times New Roman" w:hAnsi="Times New Roman" w:cs="Times New Roman"/>
-          <w:sz w:val="24"/>
-          <w:szCs w:val="24"/>
-        </w:rPr>
-        <w:t xml:space="preserve"> </w:t>
-      </w:r>
-      <w:r>
-        <w:rPr>
-          <w:rFonts w:ascii="Times New Roman" w:hAnsi="Times New Roman" w:cs="Times New Roman"/>
-          <w:sz w:val="24"/>
-          <w:szCs w:val="24"/>
-        </w:rPr>
-        <w:t>rééquilibrer la tension des fascias s’exerçant sur les berges urétrales afin de réintroduire</w:t>
-      </w:r>
-      <w:r>
-        <w:rPr>
-          <w:rFonts w:ascii="Times New Roman" w:hAnsi="Times New Roman" w:cs="Times New Roman"/>
-          <w:sz w:val="24"/>
-          <w:szCs w:val="24"/>
-        </w:rPr>
-        <w:t xml:space="preserve"> </w:t>
-      </w:r>
-      <w:r>
-        <w:rPr>
-          <w:rFonts w:ascii="Times New Roman" w:hAnsi="Times New Roman" w:cs="Times New Roman"/>
-          <w:sz w:val="24"/>
-          <w:szCs w:val="24"/>
-        </w:rPr>
-        <w:t>le sphincter urétral à l’intérieur de l’enceinte</w:t>
-      </w:r>
-      <w:r>
-        <w:rPr>
-          <w:rFonts w:ascii="Times New Roman" w:hAnsi="Times New Roman" w:cs="Times New Roman"/>
-          <w:sz w:val="24"/>
-          <w:szCs w:val="24"/>
-        </w:rPr>
-        <w:t xml:space="preserve"> manométrique</w:t>
-      </w:r>
-      <w:r>
-        <w:rPr>
-          <w:rFonts w:ascii="Times New Roman" w:hAnsi="Times New Roman" w:cs="Times New Roman"/>
-          <w:sz w:val="24"/>
-          <w:szCs w:val="24"/>
-        </w:rPr>
-        <w:t>.</w:t>
-      </w:r>
-      <w:r>
-        <w:rPr>
-          <w:rFonts w:ascii="Times New Roman" w:hAnsi="Times New Roman" w:cs="Times New Roman"/>
-          <w:sz w:val="24"/>
-          <w:szCs w:val="24"/>
-        </w:rPr>
-        <w:t xml:space="preserve"> Le renforcement des muscles abdominaux pourra ensuite être entrepris en privilégiant une réédu</w:t>
-      </w:r>
-      <w:r>
-        <w:rPr>
-          <w:rFonts w:ascii="Times New Roman" w:hAnsi="Times New Roman" w:cs="Times New Roman"/>
-          <w:sz w:val="24"/>
-          <w:szCs w:val="24"/>
-        </w:rPr>
-        <w:t xml:space="preserve">cation </w:t>
+        <w:t xml:space="preserve"> : le renforcement trop précoce des muscles abdominaux chez la femme dans le post-partum, aggrave cette incontinence. Il faut d’abord rééquilibrer la tension des fascias s’exerçant sur les berges urétrales afin de réintroduire le sphincter urétral à l’intérieur de l’enceinte manométrique. Le renforcement des muscles abdominaux pourra ensuite être entrepris en privilégiant une rééducation </w:t>
       </w:r>
       <w:proofErr w:type="spellStart"/>
       <w:r>
@@ -3647,29 +2506,12 @@
           <w:sz w:val="24"/>
           <w:szCs w:val="24"/>
         </w:rPr>
-        <w:t xml:space="preserve"> basée sur</w:t>
-      </w:r>
-      <w:r>
-        <w:rPr>
-          <w:rFonts w:ascii="Times New Roman" w:hAnsi="Times New Roman" w:cs="Times New Roman"/>
-          <w:sz w:val="24"/>
-          <w:szCs w:val="24"/>
-        </w:rPr>
-        <w:t xml:space="preserve"> le rôle expirateur du muscle transverse de l’abdomen</w:t>
-      </w:r>
-      <w:r>
-        <w:rPr>
-          <w:rFonts w:ascii="Times New Roman" w:hAnsi="Times New Roman" w:cs="Times New Roman"/>
-          <w:sz w:val="24"/>
-          <w:szCs w:val="24"/>
-        </w:rPr>
-        <w:t xml:space="preserve">. </w:t>
+        <w:t xml:space="preserve"> basée sur le rôle expirateur du muscle transverse de l’abdomen. </w:t>
       </w:r>
     </w:p>
     <w:p>
       <w:pPr>
         <w:pStyle w:val="Heading1"/>
-        <w:keepNext/>
         <w:spacing w:before="160" w:after="60"/>
         <w:rPr>
           <w:color w:val="auto"/>
@@ -3683,7 +2525,6 @@
     <w:p>
       <w:pPr>
         <w:pStyle w:val="Heading2"/>
-        <w:keepNext/>
         <w:spacing w:before="100" w:after="60"/>
         <w:rPr>
           <w:rFonts w:ascii="Times New Roman" w:hAnsi="Times New Roman" w:cs="Times New Roman"/>
@@ -3696,8 +2537,7 @@
     </w:p>
     <w:p>
       <w:pPr>
-        <w:pStyle w:val="Heading3"/>
-        <w:keepNext/>
+        <w:pStyle w:val="Heading31"/>
         <w:spacing w:before="100" w:after="60"/>
       </w:pPr>
       <w:r>
@@ -3760,15 +2600,7 @@
           <w:sz w:val="24"/>
           <w:szCs w:val="24"/>
         </w:rPr>
-        <w:t>-vésicaux</w:t>
-      </w:r>
-      <w:r>
-        <w:rPr>
-          <w:rFonts w:ascii="Times New Roman" w:hAnsi="Times New Roman" w:cs="Times New Roman"/>
-          <w:sz w:val="24"/>
-          <w:szCs w:val="24"/>
-        </w:rPr>
-        <w:t> ;</w:t>
+        <w:t>-vésicaux ;</w:t>
       </w:r>
     </w:p>
     <w:p>
@@ -3791,15 +2623,7 @@
           <w:sz w:val="24"/>
           <w:szCs w:val="24"/>
         </w:rPr>
-        <w:t>la peur et l’émotivité</w:t>
-      </w:r>
-      <w:r>
-        <w:rPr>
-          <w:rFonts w:ascii="Times New Roman" w:hAnsi="Times New Roman" w:cs="Times New Roman"/>
-          <w:sz w:val="24"/>
-          <w:szCs w:val="24"/>
-        </w:rPr>
-        <w:t> ;</w:t>
+        <w:t>la peur et l’émotivité ;</w:t>
       </w:r>
     </w:p>
     <w:p>
@@ -3822,15 +2646,7 @@
           <w:sz w:val="24"/>
           <w:szCs w:val="24"/>
         </w:rPr>
-        <w:t xml:space="preserve"> le contact de l’eau</w:t>
-      </w:r>
-      <w:r>
-        <w:rPr>
-          <w:rFonts w:ascii="Times New Roman" w:hAnsi="Times New Roman" w:cs="Times New Roman"/>
-          <w:sz w:val="24"/>
-          <w:szCs w:val="24"/>
-        </w:rPr>
-        <w:t> ;</w:t>
+        <w:t xml:space="preserve"> le contact de l’eau ;</w:t>
       </w:r>
     </w:p>
     <w:p>
@@ -3853,16 +2669,7 @@
           <w:sz w:val="24"/>
           <w:szCs w:val="24"/>
         </w:rPr>
-        <w:lastRenderedPageBreak/>
-        <w:t xml:space="preserve"> peur d’avoir envie d’uriner :</w:t>
-      </w:r>
-      <w:r>
-        <w:rPr>
-          <w:rFonts w:ascii="Times New Roman" w:hAnsi="Times New Roman" w:cs="Times New Roman"/>
-          <w:sz w:val="24"/>
-          <w:szCs w:val="24"/>
-        </w:rPr>
-        <w:t xml:space="preserve"> la personne urine par prévention sans attendre le seuil du 1</w:t>
+        <w:t xml:space="preserve"> peur d’avoir envie d’uriner : la personne urine par prévention sans attendre le seuil du 1</w:t>
       </w:r>
       <w:r>
         <w:rPr>
@@ -3879,29 +2686,12 @@
           <w:sz w:val="24"/>
           <w:szCs w:val="24"/>
         </w:rPr>
-        <w:t xml:space="preserve"> besoin. Il s’installe avec le temps</w:t>
-      </w:r>
-      <w:r>
-        <w:rPr>
-          <w:rFonts w:ascii="Times New Roman" w:hAnsi="Times New Roman" w:cs="Times New Roman"/>
-          <w:sz w:val="24"/>
-          <w:szCs w:val="24"/>
-        </w:rPr>
-        <w:t>,</w:t>
-      </w:r>
-      <w:r>
-        <w:rPr>
-          <w:rFonts w:ascii="Times New Roman" w:hAnsi="Times New Roman" w:cs="Times New Roman"/>
-          <w:sz w:val="24"/>
-          <w:szCs w:val="24"/>
-        </w:rPr>
-        <w:t xml:space="preserve"> une pollakiurie.</w:t>
-      </w:r>
-    </w:p>
-    <w:p>
-      <w:pPr>
-        <w:pStyle w:val="Heading3"/>
-        <w:keepNext/>
+        <w:t xml:space="preserve"> besoin. Il s’installe avec le temps, une pollakiurie.</w:t>
+      </w:r>
+    </w:p>
+    <w:p>
+      <w:pPr>
+        <w:pStyle w:val="Heading31"/>
         <w:spacing w:before="100" w:after="60"/>
       </w:pPr>
       <w:r>
@@ -4039,31 +2829,7 @@
           <w:sz w:val="24"/>
           <w:szCs w:val="24"/>
         </w:rPr>
-        <w:t xml:space="preserve"> N</w:t>
-      </w:r>
-      <w:r>
-        <w:rPr>
-          <w:rFonts w:ascii="Times New Roman" w:hAnsi="Times New Roman" w:cs="Times New Roman"/>
-          <w:sz w:val="24"/>
-          <w:szCs w:val="24"/>
-        </w:rPr>
-        <w:t>otre action</w:t>
-      </w:r>
-      <w:r>
-        <w:rPr>
-          <w:rFonts w:ascii="Times New Roman" w:hAnsi="Times New Roman" w:cs="Times New Roman"/>
-          <w:sz w:val="24"/>
-          <w:szCs w:val="24"/>
-        </w:rPr>
-        <w:t xml:space="preserve"> sur l’IUE</w:t>
-      </w:r>
-      <w:r>
-        <w:rPr>
-          <w:rFonts w:ascii="Times New Roman" w:hAnsi="Times New Roman" w:cs="Times New Roman"/>
-          <w:sz w:val="24"/>
-          <w:szCs w:val="24"/>
-        </w:rPr>
-        <w:t xml:space="preserve"> vise à rééquilibrer les tensions des fascias entourant l’urètre en agissant sur le plexus pudendal, les attaches du périnée sur le coccyx, la symphyse pubienne, les branches ischio-pubiennes et le noyau fibreux central du périnée. Le système hormonal participe à cet équilibre des fascias. </w:t>
+        <w:t xml:space="preserve"> Notre action sur l’IUE vise à rééquilibrer les tensions des fascias entourant l’urètre en agissant sur le plexus pudendal, les attaches du périnée sur le coccyx, la symphyse pubienne, les branches ischio-pubiennes et le noyau fibreux central du périnée. Le système hormonal participe à cet équilibre des fascias. </w:t>
       </w:r>
       <w:r>
         <w:t>Fuite non précédée d’un besoin : instabilité vésicale sur lésions structurelles responsables de ténesmes (besoin permanent et douloureux de miction), par chirurgie ou infections récidivantes ;</w:t>
@@ -4071,11 +2837,11 @@
     </w:p>
     <w:p>
       <w:pPr>
-        <w:pStyle w:val="Heading3"/>
-        <w:keepNext/>
+        <w:pStyle w:val="Heading31"/>
         <w:spacing w:before="100" w:after="60"/>
       </w:pPr>
       <w:r>
+        <w:lastRenderedPageBreak/>
         <w:t>8.1.3. Vessies neurologiques</w:t>
       </w:r>
     </w:p>
@@ -4100,7 +2866,6 @@
     <w:p>
       <w:pPr>
         <w:pStyle w:val="Heading2"/>
-        <w:keepNext/>
         <w:spacing w:before="100" w:after="60"/>
         <w:rPr>
           <w:rFonts w:ascii="Times New Roman" w:hAnsi="Times New Roman" w:cs="Times New Roman"/>
@@ -4150,16 +2915,7 @@
           <w:sz w:val="24"/>
           <w:szCs w:val="24"/>
         </w:rPr>
-        <w:t>Hématurie</w:t>
-      </w:r>
-      <w:r>
-        <w:rPr>
-          <w:rFonts w:ascii="Times New Roman" w:hAnsi="Times New Roman" w:cs="Times New Roman"/>
-          <w:b/>
-          <w:sz w:val="24"/>
-          <w:szCs w:val="24"/>
-        </w:rPr>
-        <w:t> </w:t>
+        <w:t>Hématurie </w:t>
       </w:r>
       <w:r>
         <w:rPr>
@@ -4191,16 +2947,7 @@
           <w:sz w:val="24"/>
           <w:szCs w:val="24"/>
         </w:rPr>
-        <w:t>Fièvre</w:t>
-      </w:r>
-      <w:r>
-        <w:rPr>
-          <w:rFonts w:ascii="Times New Roman" w:hAnsi="Times New Roman" w:cs="Times New Roman"/>
-          <w:b/>
-          <w:sz w:val="24"/>
-          <w:szCs w:val="24"/>
-        </w:rPr>
-        <w:t> </w:t>
+        <w:t>Fièvre </w:t>
       </w:r>
       <w:r>
         <w:rPr>
@@ -4229,130 +2976,15 @@
           <w:sz w:val="24"/>
           <w:szCs w:val="24"/>
         </w:rPr>
-        <w:t>Cystite</w:t>
-      </w:r>
-      <w:r>
-        <w:rPr>
-          <w:rFonts w:ascii="Times New Roman" w:hAnsi="Times New Roman" w:cs="Times New Roman"/>
-          <w:b/>
-          <w:sz w:val="24"/>
-          <w:szCs w:val="24"/>
-        </w:rPr>
-        <w:t>s</w:t>
-      </w:r>
-      <w:r>
-        <w:rPr>
-          <w:rFonts w:ascii="Times New Roman" w:hAnsi="Times New Roman" w:cs="Times New Roman"/>
-          <w:b/>
-          <w:sz w:val="24"/>
-          <w:szCs w:val="24"/>
-        </w:rPr>
-        <w:t xml:space="preserve"> aiguë</w:t>
-      </w:r>
-      <w:r>
-        <w:rPr>
-          <w:rFonts w:ascii="Times New Roman" w:hAnsi="Times New Roman" w:cs="Times New Roman"/>
-          <w:b/>
-          <w:sz w:val="24"/>
-          <w:szCs w:val="24"/>
-        </w:rPr>
-        <w:t>s</w:t>
-      </w:r>
-      <w:r>
-        <w:rPr>
-          <w:rFonts w:ascii="Times New Roman" w:hAnsi="Times New Roman" w:cs="Times New Roman"/>
-          <w:sz w:val="24"/>
-          <w:szCs w:val="24"/>
-        </w:rPr>
-        <w:t> :</w:t>
-      </w:r>
-      <w:r>
-        <w:rPr>
-          <w:rFonts w:ascii="Times New Roman" w:hAnsi="Times New Roman" w:cs="Times New Roman"/>
-          <w:sz w:val="24"/>
-          <w:szCs w:val="24"/>
-        </w:rPr>
-        <w:t xml:space="preserve"> </w:t>
-      </w:r>
-      <w:r>
-        <w:rPr>
-          <w:rFonts w:ascii="Times New Roman" w:hAnsi="Times New Roman" w:cs="Times New Roman"/>
-          <w:sz w:val="24"/>
-          <w:szCs w:val="24"/>
-        </w:rPr>
-        <w:t>elles sont</w:t>
-      </w:r>
-      <w:r>
-        <w:rPr>
-          <w:rFonts w:ascii="Times New Roman" w:hAnsi="Times New Roman" w:cs="Times New Roman"/>
-          <w:sz w:val="24"/>
-          <w:szCs w:val="24"/>
-        </w:rPr>
-        <w:t xml:space="preserve"> d’origi</w:t>
-      </w:r>
-      <w:r>
-        <w:rPr>
-          <w:rFonts w:ascii="Times New Roman" w:hAnsi="Times New Roman" w:cs="Times New Roman"/>
-          <w:sz w:val="24"/>
-          <w:szCs w:val="24"/>
-        </w:rPr>
-        <w:t>ne inflammatoire ou infectieus</w:t>
-      </w:r>
-      <w:r>
-        <w:rPr>
-          <w:rFonts w:ascii="Times New Roman" w:hAnsi="Times New Roman" w:cs="Times New Roman"/>
-          <w:sz w:val="24"/>
-          <w:szCs w:val="24"/>
-        </w:rPr>
-        <w:t>e.</w:t>
-      </w:r>
-      <w:r>
-        <w:rPr>
-          <w:rFonts w:ascii="Times New Roman" w:hAnsi="Times New Roman" w:cs="Times New Roman"/>
-          <w:sz w:val="24"/>
-          <w:szCs w:val="24"/>
-        </w:rPr>
-        <w:t xml:space="preserve"> </w:t>
-      </w:r>
-      <w:r>
-        <w:rPr>
-          <w:rFonts w:ascii="Times New Roman" w:hAnsi="Times New Roman" w:cs="Times New Roman"/>
-          <w:sz w:val="24"/>
-          <w:szCs w:val="24"/>
-        </w:rPr>
-        <w:t>Les causes sont multiples : psychiques, hormonales, bactériennes, virales, parasitaires et mécaniques</w:t>
-      </w:r>
-      <w:r>
-        <w:rPr>
-          <w:rFonts w:ascii="Times New Roman" w:hAnsi="Times New Roman" w:cs="Times New Roman"/>
-          <w:sz w:val="24"/>
-          <w:szCs w:val="24"/>
-        </w:rPr>
-        <w:t xml:space="preserve"> ou </w:t>
-      </w:r>
-      <w:r>
-        <w:rPr>
-          <w:rFonts w:ascii="Times New Roman" w:hAnsi="Times New Roman" w:cs="Times New Roman"/>
-          <w:sz w:val="24"/>
-          <w:szCs w:val="24"/>
-        </w:rPr>
-        <w:t>par les maladies sexu</w:t>
-      </w:r>
-      <w:r>
-        <w:rPr>
-          <w:rFonts w:ascii="Times New Roman" w:hAnsi="Times New Roman" w:cs="Times New Roman"/>
-          <w:sz w:val="24"/>
-          <w:szCs w:val="24"/>
-        </w:rPr>
-        <w:t>ellement transmissibles (MST). E</w:t>
-      </w:r>
-      <w:r>
-        <w:rPr>
-          <w:rFonts w:ascii="Times New Roman" w:hAnsi="Times New Roman" w:cs="Times New Roman"/>
-          <w:sz w:val="24"/>
-          <w:szCs w:val="24"/>
-        </w:rPr>
-        <w:t xml:space="preserve">lles sont souvent récidivantes. </w:t>
+        <w:t>Cystites aiguës</w:t>
+      </w:r>
+      <w:r>
+        <w:rPr>
+          <w:rFonts w:ascii="Times New Roman" w:hAnsi="Times New Roman" w:cs="Times New Roman"/>
+          <w:sz w:val="24"/>
+          <w:szCs w:val="24"/>
+        </w:rPr>
+        <w:t xml:space="preserve"> : elles sont d’origine inflammatoire ou infectieuse. Les causes sont multiples : psychiques, hormonales, bactériennes, virales, parasitaires et mécaniques ou par les maladies sexuellement transmissibles (MST). Elles sont souvent récidivantes. </w:t>
       </w:r>
     </w:p>
     <w:p>
@@ -4509,7 +3141,6 @@
     <w:p>
       <w:pPr>
         <w:pStyle w:val="Heading1"/>
-        <w:keepNext/>
         <w:numPr>
           <w:ilvl w:val="0"/>
           <w:numId w:val="13"/>
@@ -4571,15 +3202,7 @@
           <w:sz w:val="24"/>
           <w:szCs w:val="24"/>
         </w:rPr>
-        <w:t xml:space="preserve"> ayant des conséquences sur la miction</w:t>
-      </w:r>
-      <w:r>
-        <w:rPr>
-          <w:rFonts w:ascii="Times New Roman" w:hAnsi="Times New Roman" w:cs="Times New Roman"/>
-          <w:sz w:val="24"/>
-          <w:szCs w:val="24"/>
-        </w:rPr>
-        <w:t> ;</w:t>
+        <w:t xml:space="preserve"> ayant des conséquences sur la miction ;</w:t>
       </w:r>
     </w:p>
     <w:p>
@@ -4596,11 +3219,7 @@
         </w:rPr>
       </w:pPr>
       <w:r>
-        <w:t xml:space="preserve">Séquelles de cystites, cystalgies chroniques : notre rôle est d’agir sur les facteurs favorisant l’infection - dysbiose intestinale, déséquilibres hormonal et émotionnel, </w:t>
-      </w:r>
-      <w:r>
-        <w:lastRenderedPageBreak/>
-        <w:t>troubles statiques du bassin au cours de la grossesse et de l’accouchement - qui perturbent la dynamique de la vessie et favorisent la cystite.</w:t>
+        <w:t>Séquelles de cystites, cystalgies chroniques : notre rôle est d’agir sur les facteurs favorisant l’infection - dysbiose intestinale, déséquilibres hormonal et émotionnel, troubles statiques du bassin au cours de la grossesse et de l’accouchement - qui perturbent la dynamique de la vessie et favorisent la cystite.</w:t>
       </w:r>
     </w:p>
     <w:p>
@@ -4616,7 +3235,6 @@
     <w:p>
       <w:pPr>
         <w:pStyle w:val="Heading1"/>
-        <w:keepNext/>
         <w:spacing w:before="160" w:after="60"/>
         <w:rPr>
           <w:color w:val="auto"/>
@@ -4658,43 +3276,7 @@
           <w:szCs w:val="24"/>
           <w:lang w:val="en-US"/>
         </w:rPr>
-        <w:t xml:space="preserve"> T</w:t>
-      </w:r>
-      <w:r>
-        <w:rPr>
-          <w:rFonts w:ascii="Times New Roman" w:hAnsi="Times New Roman" w:cs="Times New Roman"/>
-          <w:sz w:val="24"/>
-          <w:szCs w:val="24"/>
-          <w:lang w:val="en-US"/>
-        </w:rPr>
-        <w:t>h</w:t>
-      </w:r>
-      <w:r>
-        <w:rPr>
-          <w:rFonts w:ascii="Times New Roman" w:hAnsi="Times New Roman" w:cs="Times New Roman"/>
-          <w:sz w:val="24"/>
-          <w:szCs w:val="24"/>
-          <w:lang w:val="en-US"/>
-        </w:rPr>
-        <w:t>11-T</w:t>
-      </w:r>
-      <w:r>
-        <w:rPr>
-          <w:rFonts w:ascii="Times New Roman" w:hAnsi="Times New Roman" w:cs="Times New Roman"/>
-          <w:sz w:val="24"/>
-          <w:szCs w:val="24"/>
-          <w:lang w:val="en-US"/>
-        </w:rPr>
-        <w:t>h</w:t>
-      </w:r>
-      <w:r>
-        <w:rPr>
-          <w:rFonts w:ascii="Times New Roman" w:hAnsi="Times New Roman" w:cs="Times New Roman"/>
-          <w:sz w:val="24"/>
-          <w:szCs w:val="24"/>
-          <w:lang w:val="en-US"/>
-        </w:rPr>
-        <w:t>12- L1-L2, sacrum, articulation-</w:t>
+        <w:t xml:space="preserve"> Th11-Th12- L1-L2, sacrum, articulation-</w:t>
       </w:r>
       <w:proofErr w:type="spellStart"/>
       <w:proofErr w:type="gramStart"/>
@@ -4738,15 +3320,7 @@
           <w:sz w:val="24"/>
           <w:szCs w:val="24"/>
         </w:rPr>
-        <w:t>Ligaments sacro</w:t>
-      </w:r>
-      <w:r>
-        <w:rPr>
-          <w:rFonts w:ascii="Times New Roman" w:hAnsi="Times New Roman" w:cs="Times New Roman"/>
-          <w:sz w:val="24"/>
-          <w:szCs w:val="24"/>
-        </w:rPr>
-        <w:t>-tubéral et sacro-</w:t>
+        <w:t>Ligaments sacro-tubéral et sacro-</w:t>
       </w:r>
       <w:proofErr w:type="spellStart"/>
       <w:r>
@@ -4786,15 +3360,7 @@
           <w:sz w:val="24"/>
           <w:szCs w:val="24"/>
         </w:rPr>
-        <w:t>Symphyse pubienne, fosses obturatrices</w:t>
-      </w:r>
-      <w:r>
-        <w:rPr>
-          <w:rFonts w:ascii="Times New Roman" w:hAnsi="Times New Roman" w:cs="Times New Roman"/>
-          <w:sz w:val="24"/>
-          <w:szCs w:val="24"/>
-        </w:rPr>
-        <w:t> ;</w:t>
+        <w:t>Symphyse pubienne, fosses obturatrices ;</w:t>
       </w:r>
     </w:p>
     <w:p>
@@ -4834,21 +3400,12 @@
           <w:sz w:val="24"/>
           <w:szCs w:val="24"/>
         </w:rPr>
-        <w:t>-fibulaires supérieure et inférieure</w:t>
-      </w:r>
-      <w:r>
-        <w:rPr>
-          <w:rFonts w:ascii="Times New Roman" w:hAnsi="Times New Roman" w:cs="Times New Roman"/>
-          <w:sz w:val="24"/>
-          <w:szCs w:val="24"/>
-        </w:rPr>
-        <w:t>.</w:t>
+        <w:t>-fibulaires supérieure et inférieure.</w:t>
       </w:r>
     </w:p>
     <w:p>
       <w:pPr>
         <w:pStyle w:val="Heading1"/>
-        <w:keepNext/>
         <w:spacing w:before="160" w:after="60"/>
         <w:rPr>
           <w:color w:val="auto"/>
@@ -4891,7 +3448,11 @@
         </w:rPr>
       </w:pPr>
       <w:r>
-        <w:t xml:space="preserve"> La vessie est un organe plutôt féminin où la personne «vessie» est réservée, effacée, timide, soumise. Elle a du mal à s’exprimer, connaissant plus ses devoirs que ses droits. L’excès de pudeur rend l’adolescente difficile à accepter les transformations dans son corps et plus tard, à accepter celui des autres.</w:t>
+        <w:t xml:space="preserve"> La vessie est un organe plutôt féminin où la personne «vessie» est réservée, effacée, timide, soumise. Elle a du mal à s’exprimer, connaissant plus ses devoirs que ses droits. L’excès de pudeur rend </w:t>
+      </w:r>
+      <w:r>
+        <w:lastRenderedPageBreak/>
+        <w:t>l’adolescente difficile à accepter les transformations dans son corps et plus tard, à accepter celui des autres.</w:t>
       </w:r>
     </w:p>
     <w:p>
@@ -4909,7 +3470,6 @@
     <w:p>
       <w:pPr>
         <w:pStyle w:val="Heading1"/>
-        <w:keepNext/>
         <w:spacing w:before="160" w:after="60"/>
         <w:rPr>
           <w:highlight w:val="yellow"/>
@@ -5082,42 +3642,25 @@
     </w:p>
     <w:p>
       <w:pPr>
-        <w:jc w:val="both"/>
-        <w:rPr>
-          <w:rFonts w:ascii="Times New Roman" w:hAnsi="Times New Roman" w:cs="Times New Roman"/>
-          <w:sz w:val="24"/>
-          <w:szCs w:val="24"/>
-        </w:rPr>
-      </w:pPr>
+        <w:pStyle w:val="Heading1"/>
+      </w:pPr>
+      <w:r>
+        <w:t xml:space="preserve">13. Zones réflexes </w:t>
+      </w:r>
+      <w:r>
+        <w:t>ROP</w:t>
+      </w:r>
     </w:p>
     <w:p/>
-    <w:p/>
-    <w:p/>
-    <w:p/>
-    <w:p/>
-    <w:p/>
-    <w:p>
-      <w:pPr>
-        <w:pStyle w:val="Heading1"/>
-      </w:pPr>
-      <w:r>
-        <w:t>13. Zones réflexes podales</w:t>
-      </w:r>
-    </w:p>
-    <w:p>
-      <w:r>
-        <w:rPr>
-          <w:i w:val="0"/>
-        </w:rPr>
-        <w:t>Les localisations décrites ci-dessous appartiennent à la cartographie clinique de la ROP. Elles ne constituent pas une projection anatomique directe de la vessie, de ses nerfs ou de ses centres de contrôle sur le pied. Leur sélection dépend de l’anamnèse, des tests, des réactions palpatoires et du trouble fonctionnel concerné.</w:t>
-      </w:r>
-    </w:p>
-    <w:p>
-      <w:r>
-        <w:rPr>
-          <w:i w:val="0"/>
-        </w:rPr>
-        <w:t>Pour la vessie, cette cartographie est particulièrement intéressante car elle peut être organisée selon les quatre niveaux du protocole ROP, depuis les centres d’intégration jusqu’aux relations somatiques et émotionnelles.</w:t>
+    <w:p>
+      <w:r>
+        <w:t xml:space="preserve">Pour la vessie, cette cartographie </w:t>
+      </w:r>
+      <w:r>
+        <w:t xml:space="preserve">ROP </w:t>
+      </w:r>
+      <w:r>
+        <w:t>est particulièrement intéressante car elle peut être organisée selon les quatre niveaux du protocole ROP, depuis les centres d’intégration jusqu’aux relations somatiques et émotionnelles.</w:t>
       </w:r>
     </w:p>
     <w:p>
@@ -5125,15 +3668,18 @@
         <w:pStyle w:val="Heading2"/>
       </w:pPr>
       <w:r>
-        <w:t>13.1. Repères loco-régionaux de la vessie</w:t>
-      </w:r>
-    </w:p>
-    <w:p>
-      <w:r>
-        <w:rPr>
-          <w:i w:val="0"/>
-        </w:rPr>
-        <w:t>Les principaux repères podaux décrits dans la méthode sont conservés : vessie, trigone et région cervico-urétrale, urètre et sphincter externe, périnée, ligaments pubovésicaux et cavité pelvienne.</w:t>
+        <w:t>13.</w:t>
+      </w:r>
+      <w:r>
+        <w:t>1</w:t>
+      </w:r>
+      <w:r>
+        <w:t>. Niveau 1 — Régulation des centres supérieurs</w:t>
+      </w:r>
+    </w:p>
+    <w:p>
+      <w:r>
+        <w:t>Le Niveau 1 n’est pas systématique pour tout trouble vésical. Il devient particulièrement pertinent lorsque l’urgence, la pollakiurie, l’énurésie, l’hypervigilance corporelle, le stress ou l’anticipation du besoin suggèrent une participation importante des mécanismes centraux.</w:t>
       </w:r>
     </w:p>
     <w:p>
@@ -5143,10 +3689,7 @@
         <w:ind w:left="255" w:hanging="142"/>
       </w:pPr>
       <w:r>
-        <w:t xml:space="preserve">• </w:t>
-      </w:r>
-      <w:r>
-        <w:t>Ligaments pubovésicaux : bord postérieur de la malléole tibiale, selon la cartographie ROP.</w:t>
+        <w:t>• Zones réflexes occipitales.</w:t>
       </w:r>
     </w:p>
     <w:p>
@@ -5156,10 +3699,7 @@
         <w:ind w:left="255" w:hanging="142"/>
       </w:pPr>
       <w:r>
-        <w:t xml:space="preserve">• </w:t>
-      </w:r>
-      <w:r>
-        <w:t>Trigone de la vessie et région cervico-urétrale : région postéro-médiale du calcanéum ; un sillon orienté dorsalement et postérieurement conduit à la fossette de repérage.</w:t>
+        <w:t>• Tronc cérébral et centres d’intégration.</w:t>
       </w:r>
     </w:p>
     <w:p>
@@ -5169,10 +3709,7 @@
         <w:ind w:left="255" w:hanging="142"/>
       </w:pPr>
       <w:r>
-        <w:t xml:space="preserve">• </w:t>
-      </w:r>
-      <w:r>
-        <w:t>Vessie et corps de l’utérus : zone légèrement bombée située en avant du trigone dans la cartographie ROP.</w:t>
+        <w:t>• Diencéphale, notamment hypothalamus.</w:t>
       </w:r>
     </w:p>
     <w:p>
@@ -5182,10 +3719,7 @@
         <w:ind w:left="255" w:hanging="142"/>
       </w:pPr>
       <w:r>
-        <w:t xml:space="preserve">• </w:t>
-      </w:r>
-      <w:r>
-        <w:t>Fente uro-génitale, noyau fibreux central du périnée, urètre et sphincter externe : bord inférieur du calcanéum, en avant du repère du coccyx.</w:t>
+        <w:t>• Axe hypothalamo-hypophysaire.</w:t>
       </w:r>
     </w:p>
     <w:p>
@@ -5195,18 +3729,35 @@
         <w:ind w:left="255" w:hanging="142"/>
       </w:pPr>
       <w:r>
-        <w:t xml:space="preserve">• </w:t>
-      </w:r>
-      <w:r>
-        <w:t>Cavité pelvienne et périnée : repères régionaux précisés dans les figures du chapitre 17.</w:t>
-      </w:r>
-    </w:p>
-    <w:p>
-      <w:r>
-        <w:rPr>
-          <w:i w:val="0"/>
-        </w:rPr>
-        <w:t>Ces repères constituent la base pratique de la cartographie vésicale. Ils sont ensuite intégrés aux quatre niveaux selon le tableau clinique.</w:t>
+        <w:t>• Environnement neuro-méningé et circulation du LCR dans le modèle ROP.</w:t>
+      </w:r>
+    </w:p>
+    <w:p>
+      <w:pPr>
+        <w:spacing w:after="80"/>
+      </w:pPr>
+      <w:r>
+        <w:rPr>
+          <w:i/>
+          <w:color w:val="5E666A"/>
+        </w:rPr>
+        <w:t>Cf. chapitre 3 — Système nerveux central, Niveau 1 : Régulation des centres supérieurs.</w:t>
+      </w:r>
+    </w:p>
+    <w:p>
+      <w:pPr>
+        <w:shd w:val="clear" w:color="auto" w:fill="F3EEE4"/>
+        <w:spacing w:before="80" w:after="100"/>
+        <w:ind w:left="142" w:right="142"/>
+      </w:pPr>
+      <w:r>
+        <w:rPr>
+          <w:b/>
+        </w:rPr>
+        <w:t xml:space="preserve">Intérêt en ROP — </w:t>
+      </w:r>
+      <w:r>
+        <w:t>Le Niveau 1 vise ici la régulation générale et la manière dont le besoin urinaire est intégré et contextualisé. Il ne signifie pas qu’une zone podale active directement une structure cérébrale précise.</w:t>
       </w:r>
     </w:p>
     <w:p>
@@ -5214,15 +3765,19 @@
         <w:pStyle w:val="Heading2"/>
       </w:pPr>
       <w:r>
-        <w:t>13.2. Niveau 1 — Régulation des centres supérieurs</w:t>
-      </w:r>
-    </w:p>
-    <w:p>
-      <w:r>
-        <w:rPr>
-          <w:i w:val="0"/>
-        </w:rPr>
-        <w:t>Le Niveau 1 n’est pas systématique pour tout trouble vésical. Il devient particulièrement pertinent lorsque l’urgence, la pollakiurie, l’énurésie, l’hypervigilance corporelle, le stress ou l’anticipation du besoin suggèrent une participation importante des mécanismes centraux.</w:t>
+        <w:lastRenderedPageBreak/>
+        <w:t>13.</w:t>
+      </w:r>
+      <w:r>
+        <w:t>2</w:t>
+      </w:r>
+      <w:r>
+        <w:t>. Niveau 2 — Régulation neuro-végétative et adaptation</w:t>
+      </w:r>
+    </w:p>
+    <w:p>
+      <w:r>
+        <w:t>C’est l’un des niveaux essentiels pour la vessie. Les principales portes sont le parasympathique pelvien S2-S4, les voies sympathiques thoraco-lombaires et le plexus hypogastrique inférieur.</w:t>
       </w:r>
     </w:p>
     <w:p>
@@ -5232,10 +3787,7 @@
         <w:ind w:left="255" w:hanging="142"/>
       </w:pPr>
       <w:r>
-        <w:t xml:space="preserve">• </w:t>
-      </w:r>
-      <w:r>
-        <w:t>Zones réflexes occipitales.</w:t>
+        <w:t>• Parasympathique pelvien : segments sacrés S2-S4 selon la cartographie médullaire ROP.</w:t>
       </w:r>
     </w:p>
     <w:p>
@@ -5245,10 +3797,7 @@
         <w:ind w:left="255" w:hanging="142"/>
       </w:pPr>
       <w:r>
-        <w:t xml:space="preserve">• </w:t>
-      </w:r>
-      <w:r>
-        <w:t>Tronc cérébral et centres d’intégration.</w:t>
+        <w:t>• Voies sympathiques : territoire approximatif T11-L2 et chaînes sympathiques lombaires et sacrales.</w:t>
       </w:r>
     </w:p>
     <w:p>
@@ -5258,10 +3807,7 @@
         <w:ind w:left="255" w:hanging="142"/>
       </w:pPr>
       <w:r>
-        <w:t xml:space="preserve">• </w:t>
-      </w:r>
-      <w:r>
-        <w:t>Diencéphale, notamment hypothalamus.</w:t>
+        <w:t>• Plexus hypogastrique inférieur : repères pelviens de la cartographie ROP.</w:t>
       </w:r>
     </w:p>
     <w:p>
@@ -5271,10 +3817,7 @@
         <w:ind w:left="255" w:hanging="142"/>
       </w:pPr>
       <w:r>
-        <w:t xml:space="preserve">• </w:t>
-      </w:r>
-      <w:r>
-        <w:t>Axe hypothalamo-hypophysaire.</w:t>
+        <w:t>• Nerfs hypogastriques : à considérer comme voie de distribution sympathique régionale.</w:t>
       </w:r>
     </w:p>
     <w:p>
@@ -5284,10 +3827,7 @@
         <w:ind w:left="255" w:hanging="142"/>
       </w:pPr>
       <w:r>
-        <w:t xml:space="preserve">• </w:t>
-      </w:r>
-      <w:r>
-        <w:t>Environnement neuro-méningé et circulation du LCR dans le modèle ROP.</w:t>
+        <w:t>• Coordination stockage-vidange : à privilégier comme logique fonctionnelle plutôt qu’une stimulation isolée du sympathique ou du parasympathique.</w:t>
       </w:r>
     </w:p>
     <w:p>
@@ -5299,12 +3839,12 @@
           <w:i/>
           <w:color w:val="5E666A"/>
         </w:rPr>
-        <w:t>Cf. chapitre 3 — Système nerveux central, Niveau 1 : Régulation des centres supérieurs.</w:t>
-      </w:r>
-    </w:p>
-    <w:p>
-      <w:pPr>
-        <w:shd w:fill="F3EEE4"/>
+        <w:t>Cf. chapitre 4 — Système nerveux autonome, notamment les sections « Parasympathique pelvien », « Sympathique viscéro-moteur » et « Plexus préviscéral pelvien ».</w:t>
+      </w:r>
+    </w:p>
+    <w:p>
+      <w:pPr>
+        <w:shd w:val="clear" w:color="auto" w:fill="F3EEE4"/>
         <w:spacing w:before="80" w:after="100"/>
         <w:ind w:left="142" w:right="142"/>
       </w:pPr>
@@ -5315,7 +3855,24 @@
         <w:t xml:space="preserve">Intérêt en ROP — </w:t>
       </w:r>
       <w:r>
-        <w:t>Le Niveau 1 vise ici la régulation générale et la manière dont le besoin urinaire est intégré et contextualisé. Il ne signifie pas qu’une zone podale active directement une structure cérébrale précise.</w:t>
+        <w:t>Pour la vessie, le Niveau 2 vise moins à « stimuler le parasympathique » qu’à accompagner la coordination stockage – perception – vidange.</w:t>
+      </w:r>
+    </w:p>
+    <w:p>
+      <w:pPr>
+        <w:shd w:val="clear" w:color="auto" w:fill="EEF5F5"/>
+        <w:spacing w:before="80" w:after="100"/>
+        <w:ind w:left="142" w:right="142"/>
+      </w:pPr>
+      <w:r>
+        <w:rPr>
+          <w:b/>
+          <w:color w:val="4D5A60"/>
+        </w:rPr>
+        <w:t xml:space="preserve">Pont neuro-anatomique candidat — nerf tibial et circuits vésicaux. </w:t>
+      </w:r>
+      <w:r>
+        <w:t>La neuromodulation tibiale montre qu’une stimulation somatique périphérique peut modifier certains symptômes d’hyperactivité vésicale. Cela constitue un modèle de plausibilité pour une modulation somato-viscérale ; cela ne démontre pas qu’une pression manuelle ROP exerce le même effet.</w:t>
       </w:r>
     </w:p>
     <w:p>
@@ -5323,15 +3880,18 @@
         <w:pStyle w:val="Heading2"/>
       </w:pPr>
       <w:r>
-        <w:t>13.3. Niveau 2 — Régulation neuro-végétative et adaptation</w:t>
-      </w:r>
-    </w:p>
-    <w:p>
-      <w:r>
-        <w:rPr>
-          <w:i w:val="0"/>
-        </w:rPr>
-        <w:t>C’est l’un des niveaux essentiels pour la vessie. Les principales portes sont le parasympathique pelvien S2-S4, les voies sympathiques thoraco-lombaires et le plexus hypogastrique inférieur.</w:t>
+        <w:t>13.</w:t>
+      </w:r>
+      <w:r>
+        <w:t>3</w:t>
+      </w:r>
+      <w:r>
+        <w:t>. Niveau 3 — Régulation viscérale loco-régionale</w:t>
+      </w:r>
+    </w:p>
+    <w:p>
+      <w:r>
+        <w:t>Le Niveau 3 rassemble le cœur de la cartographie propre à l’organe : cavité pelvienne, vessie, région cervico-trigonale, urètre et environnement de soutien.</w:t>
       </w:r>
     </w:p>
     <w:p>
@@ -5341,10 +3901,7 @@
         <w:ind w:left="255" w:hanging="142"/>
       </w:pPr>
       <w:r>
-        <w:t xml:space="preserve">• </w:t>
-      </w:r>
-      <w:r>
-        <w:t>Parasympathique pelvien : segments sacrés S2-S4 selon la cartographie médullaire ROP.</w:t>
+        <w:t>• Cavité pelvienne et périnée.</w:t>
       </w:r>
     </w:p>
     <w:p>
@@ -5354,10 +3911,7 @@
         <w:ind w:left="255" w:hanging="142"/>
       </w:pPr>
       <w:r>
-        <w:t xml:space="preserve">• </w:t>
-      </w:r>
-      <w:r>
-        <w:t>Voies sympathiques : territoire approximatif T11-L2 et chaînes sympathiques lombaires et sacrales.</w:t>
+        <w:t>• Vessie et dôme vésical.</w:t>
       </w:r>
     </w:p>
     <w:p>
@@ -5367,10 +3921,7 @@
         <w:ind w:left="255" w:hanging="142"/>
       </w:pPr>
       <w:r>
-        <w:t xml:space="preserve">• </w:t>
-      </w:r>
-      <w:r>
-        <w:t>Plexus hypogastrique inférieur : repères pelviens de la cartographie ROP.</w:t>
+        <w:t>• Trigone et région cervico-urétrale.</w:t>
       </w:r>
     </w:p>
     <w:p>
@@ -5380,10 +3931,7 @@
         <w:ind w:left="255" w:hanging="142"/>
       </w:pPr>
       <w:r>
-        <w:t xml:space="preserve">• </w:t>
-      </w:r>
-      <w:r>
-        <w:t>Nerfs hypogastriques : à considérer comme voie de distribution sympathique régionale.</w:t>
+        <w:t>• Urètre et sphincter externe.</w:t>
       </w:r>
     </w:p>
     <w:p>
@@ -5393,10 +3941,17 @@
         <w:ind w:left="255" w:hanging="142"/>
       </w:pPr>
       <w:r>
-        <w:t xml:space="preserve">• </w:t>
-      </w:r>
-      <w:r>
-        <w:t>Coordination stockage-vidange : à privilégier comme logique fonctionnelle plutôt qu’une stimulation isolée du sympathique ou du parasympathique.</w:t>
+        <w:t>• Symphyse pubienne et structures pubovésicales.</w:t>
+      </w:r>
+    </w:p>
+    <w:p>
+      <w:pPr>
+        <w:pStyle w:val="ListParagraph"/>
+        <w:spacing w:after="36"/>
+        <w:ind w:left="255" w:hanging="142"/>
+      </w:pPr>
+      <w:r>
+        <w:t>• Péritoine supérieur de la vessie et rapports avec les organes voisins.</w:t>
       </w:r>
     </w:p>
     <w:p>
@@ -5408,12 +3963,12 @@
           <w:i/>
           <w:color w:val="5E666A"/>
         </w:rPr>
-        <w:t>Cf. chapitre 4 — Système nerveux autonome, notamment les sections « Parasympathique pelvien », « Sympathique viscéro-moteur » et « Plexus préviscéral pelvien ».</w:t>
-      </w:r>
-    </w:p>
-    <w:p>
-      <w:pPr>
-        <w:shd w:fill="F3EEE4"/>
+        <w:t>Cf. chapitre 17 — Cavité pelvienne, Niveau 3 : Régulation viscérale loco-régionale.</w:t>
+      </w:r>
+    </w:p>
+    <w:p>
+      <w:pPr>
+        <w:shd w:val="clear" w:color="auto" w:fill="F3EEE4"/>
         <w:spacing w:before="80" w:after="100"/>
         <w:ind w:left="142" w:right="142"/>
       </w:pPr>
@@ -5424,24 +3979,7 @@
         <w:t xml:space="preserve">Intérêt en ROP — </w:t>
       </w:r>
       <w:r>
-        <w:t>Pour la vessie, le Niveau 2 vise moins à « stimuler le parasympathique » qu’à accompagner la coordination stockage – perception – vidange.</w:t>
-      </w:r>
-    </w:p>
-    <w:p>
-      <w:pPr>
-        <w:shd w:fill="EEF5F5"/>
-        <w:spacing w:before="80" w:after="100"/>
-        <w:ind w:left="142" w:right="142"/>
-      </w:pPr>
-      <w:r>
-        <w:rPr>
-          <w:b/>
-          <w:color w:val="4D5A60"/>
-        </w:rPr>
-        <w:t xml:space="preserve">Pont neuro-anatomique candidat — nerf tibial et circuits vésicaux. </w:t>
-      </w:r>
-      <w:r>
-        <w:t>La neuromodulation tibiale montre qu’une stimulation somatique périphérique peut modifier certains symptômes d’hyperactivité vésicale. Cela constitue un modèle de plausibilité pour une modulation somato-viscérale ; cela ne démontre pas qu’une pression manuelle ROP exerce le même effet.</w:t>
+        <w:t>Le Niveau 3 replace la vessie dans son environnement régional. Une sensibilité d’une zone réflexe ou une modification palpatoire constitue un repère clinique, non la preuve d’une tension anatomique précise du ligament ou de l’organe correspondant.</w:t>
       </w:r>
     </w:p>
     <w:p>
@@ -5449,15 +3987,32 @@
         <w:pStyle w:val="Heading2"/>
       </w:pPr>
       <w:r>
-        <w:t>13.4. Niveau 3 — Régulation viscérale loco-régionale</w:t>
-      </w:r>
-    </w:p>
-    <w:p>
-      <w:r>
-        <w:rPr>
-          <w:i w:val="0"/>
-        </w:rPr>
-        <w:t>Le Niveau 3 rassemble le cœur de la cartographie propre à l’organe : cavité pelvienne, vessie, région cervico-trigonale, urètre et environnement de soutien.</w:t>
+        <w:t>13.</w:t>
+      </w:r>
+      <w:r>
+        <w:t>4</w:t>
+      </w:r>
+      <w:r>
+        <w:t>. Niveau 4 — Intégration viscéro-somatique et viscéro-émotionnelle</w:t>
+      </w:r>
+    </w:p>
+    <w:p>
+      <w:r>
+        <w:t>Cette partie remplace l’ancienne rubrique « Système limbique ». Elle relie le symptôme vésical aux convergences somatiques, au plancher pelvien et au contexte de perception et d’adaptation.</w:t>
+      </w:r>
+    </w:p>
+    <w:p>
+      <w:pPr>
+        <w:pStyle w:val="Heading31"/>
+      </w:pPr>
+      <w:r>
+        <w:t>13.</w:t>
+      </w:r>
+      <w:r>
+        <w:t>4</w:t>
+      </w:r>
+      <w:r>
+        <w:t>.1. Versant viscéro-somatique</w:t>
       </w:r>
     </w:p>
     <w:p>
@@ -5467,10 +4022,7 @@
         <w:ind w:left="255" w:hanging="142"/>
       </w:pPr>
       <w:r>
-        <w:t xml:space="preserve">• </w:t>
-      </w:r>
-      <w:r>
-        <w:t>Cavité pelvienne et périnée.</w:t>
+        <w:t>• Nerf pudendal S2-S4.</w:t>
       </w:r>
     </w:p>
     <w:p>
@@ -5480,10 +4032,7 @@
         <w:ind w:left="255" w:hanging="142"/>
       </w:pPr>
       <w:r>
-        <w:t xml:space="preserve">• </w:t>
-      </w:r>
-      <w:r>
-        <w:t>Vessie et dôme vésical.</w:t>
+        <w:t>• Plancher pelvien et sphincter urétral externe.</w:t>
       </w:r>
     </w:p>
     <w:p>
@@ -5493,10 +4042,7 @@
         <w:ind w:left="255" w:hanging="142"/>
       </w:pPr>
       <w:r>
-        <w:t xml:space="preserve">• </w:t>
-      </w:r>
-      <w:r>
-        <w:t>Trigone et région cervico-urétrale.</w:t>
+        <w:t>• Sacrum et coccyx.</w:t>
       </w:r>
     </w:p>
     <w:p>
@@ -5506,10 +4052,7 @@
         <w:ind w:left="255" w:hanging="142"/>
       </w:pPr>
       <w:r>
-        <w:t xml:space="preserve">• </w:t>
-      </w:r>
-      <w:r>
-        <w:t>Urètre et sphincter externe.</w:t>
+        <w:t>• Symphyse pubienne.</w:t>
       </w:r>
     </w:p>
     <w:p>
@@ -5519,10 +4062,62 @@
         <w:ind w:left="255" w:hanging="142"/>
       </w:pPr>
       <w:r>
-        <w:t xml:space="preserve">• </w:t>
-      </w:r>
-      <w:r>
-        <w:t>Symphyse pubienne et structures pubovésicales.</w:t>
+        <w:t>• Territoires lombo-sacrés associés aux afférences vésicales.</w:t>
+      </w:r>
+    </w:p>
+    <w:p>
+      <w:r>
+        <w:t>Le nerf pudendal est une voie somatique distincte des nerfs splanchniques pelviens autonomes, même s’ils partagent une proximité segmentaire S2-S4.</w:t>
+      </w:r>
+    </w:p>
+    <w:p>
+      <w:pPr>
+        <w:pStyle w:val="Heading31"/>
+      </w:pPr>
+      <w:r>
+        <w:t>13.</w:t>
+      </w:r>
+      <w:r>
+        <w:t>4</w:t>
+      </w:r>
+      <w:r>
+        <w:t>.2. Versant viscéro-émotionnel</w:t>
+      </w:r>
+    </w:p>
+    <w:p>
+      <w:r>
+        <w:t>La terminologie « balance cerveau limbique-vessie » est remplacée par « axe cerveau-vessie ». Cette expression décrit l’intégration des signaux vésicaux avec les réseaux cérébraux impliqués dans l’interoception, l’attention, l’urgence, le contrôle contextuel et le vécu émotionnel.</w:t>
+      </w:r>
+    </w:p>
+    <w:p>
+      <w:r>
+        <w:lastRenderedPageBreak/>
+        <w:t>Dans le modèle clinique ROP, l’écoute-induction peut conserver son principe — un repère sur la zone vésicale et un repère central — mais elle doit être présentée comme une technique d’intégration fonctionnelle, et non comme une action directe sur un « cerveau limbique ».</w:t>
+      </w:r>
+    </w:p>
+    <w:p>
+      <w:pPr>
+        <w:spacing w:after="80"/>
+      </w:pPr>
+      <w:r>
+        <w:rPr>
+          <w:i/>
+          <w:color w:val="5E666A"/>
+        </w:rPr>
+        <w:t>Cf. chapitre 3 — Système nerveux central pour les réseaux centraux et cortico-limbiques ; cf. section 11 « Relations viscéro-émotionnelles » du présent chapitre.</w:t>
+      </w:r>
+    </w:p>
+    <w:p>
+      <w:pPr>
+        <w:pStyle w:val="Heading2"/>
+      </w:pPr>
+      <w:r>
+        <w:t>13.6. Soutiens associés selon les tests</w:t>
+      </w:r>
+    </w:p>
+    <w:p>
+      <w:r>
+        <w:t>Les territoires foie, intestins et reins figuraient auparavant dans le « syndrome général d’adaptation ». Ils peuvent être conservés comme soutiens associés, mais ne doivent pas être considérés comme des étapes obligatoires du traitement de la vessie.</w:t>
       </w:r>
     </w:p>
     <w:p>
@@ -5532,62 +4127,7 @@
         <w:ind w:left="255" w:hanging="142"/>
       </w:pPr>
       <w:r>
-        <w:t xml:space="preserve">• </w:t>
-      </w:r>
-      <w:r>
-        <w:t>Péritoine supérieur de la vessie et rapports avec les organes voisins.</w:t>
-      </w:r>
-    </w:p>
-    <w:p>
-      <w:pPr>
-        <w:spacing w:after="80"/>
-      </w:pPr>
-      <w:r>
-        <w:rPr>
-          <w:i/>
-          <w:color w:val="5E666A"/>
-        </w:rPr>
-        <w:t>Cf. chapitre 17 — Cavité pelvienne, Niveau 3 : Régulation viscérale loco-régionale.</w:t>
-      </w:r>
-    </w:p>
-    <w:p>
-      <w:pPr>
-        <w:shd w:fill="F3EEE4"/>
-        <w:spacing w:before="80" w:after="100"/>
-        <w:ind w:left="142" w:right="142"/>
-      </w:pPr>
-      <w:r>
-        <w:rPr>
-          <w:b/>
-        </w:rPr>
-        <w:t xml:space="preserve">Intérêt en ROP — </w:t>
-      </w:r>
-      <w:r>
-        <w:t>Le Niveau 3 replace la vessie dans son environnement régional. Une sensibilité d’une zone réflexe ou une modification palpatoire constitue un repère clinique, non la preuve d’une tension anatomique précise du ligament ou de l’organe correspondant.</w:t>
-      </w:r>
-    </w:p>
-    <w:p>
-      <w:pPr>
-        <w:pStyle w:val="Heading2"/>
-      </w:pPr>
-      <w:r>
-        <w:t>13.5. Niveau 4 — Intégration viscéro-somatique et viscéro-émotionnelle</w:t>
-      </w:r>
-    </w:p>
-    <w:p>
-      <w:r>
-        <w:rPr>
-          <w:i w:val="0"/>
-        </w:rPr>
-        <w:t>Cette partie remplace l’ancienne rubrique « Système limbique ». Elle relie le symptôme vésical aux convergences somatiques, au plancher pelvien et au contexte de perception et d’adaptation.</w:t>
-      </w:r>
-    </w:p>
-    <w:p>
-      <w:pPr>
-        <w:pStyle w:val="Heading3"/>
-      </w:pPr>
-      <w:r>
-        <w:t>13.5.1. Versant viscéro-somatique</w:t>
+        <w:t>• Reins et uretères : lorsque le contexte urinaire ou rénal le justifie.</w:t>
       </w:r>
     </w:p>
     <w:p>
@@ -5597,10 +4137,7 @@
         <w:ind w:left="255" w:hanging="142"/>
       </w:pPr>
       <w:r>
-        <w:t xml:space="preserve">• </w:t>
-      </w:r>
-      <w:r>
-        <w:t>Nerf pudendal S2-S4.</w:t>
+        <w:t>• Intestin et côlon : en présence de constipation, dysfonction digestive ou contexte pelvien associé.</w:t>
       </w:r>
     </w:p>
     <w:p>
@@ -5610,10 +4147,20 @@
         <w:ind w:left="255" w:hanging="142"/>
       </w:pPr>
       <w:r>
-        <w:t xml:space="preserve">• </w:t>
-      </w:r>
-      <w:r>
-        <w:t>Plancher pelvien et sphincter urétral externe.</w:t>
+        <w:t>• Foie et autres territoires systémiques : uniquement lorsqu’ils sont retenus par l’anamnèse, les tests et la cohérence clinique.</w:t>
+      </w:r>
+    </w:p>
+    <w:p>
+      <w:pPr>
+        <w:pStyle w:val="Heading2"/>
+      </w:pPr>
+      <w:r>
+        <w:t>13.7. Lecture clinique selon le symptôme</w:t>
+      </w:r>
+    </w:p>
+    <w:p>
+      <w:r>
+        <w:t>La hiérarchie des zones varie selon le trouble fonctionnel et ne doit pas être appliquée comme une séquence rigide.</w:t>
       </w:r>
     </w:p>
     <w:p>
@@ -5623,10 +4170,7 @@
         <w:ind w:left="255" w:hanging="142"/>
       </w:pPr>
       <w:r>
-        <w:t xml:space="preserve">• </w:t>
-      </w:r>
-      <w:r>
-        <w:t>Sacrum et coccyx.</w:t>
+        <w:t>• Hyperactivité vésicale / urgenturie : importance possible des Niveaux 1, 2 et 4, en complément du travail direct sur la vessie au Niveau 3.</w:t>
       </w:r>
     </w:p>
     <w:p>
@@ -5636,10 +4180,7 @@
         <w:ind w:left="255" w:hanging="142"/>
       </w:pPr>
       <w:r>
-        <w:t xml:space="preserve">• </w:t>
-      </w:r>
-      <w:r>
-        <w:t>Symphyse pubienne.</w:t>
+        <w:t>• Incontinence urinaire d’effort : priorité fréquente au Niveau 3 et au versant somatique du Niveau 4 — urètre, pubis, plancher pelvien, pudendal — avec intégration du Niveau 2 selon les tests.</w:t>
       </w:r>
     </w:p>
     <w:p>
@@ -5649,86 +4190,7 @@
         <w:ind w:left="255" w:hanging="142"/>
       </w:pPr>
       <w:r>
-        <w:t xml:space="preserve">• </w:t>
-      </w:r>
-      <w:r>
-        <w:t>Territoires lombo-sacrés associés aux afférences vésicales.</w:t>
-      </w:r>
-    </w:p>
-    <w:p>
-      <w:r>
-        <w:rPr>
-          <w:i w:val="0"/>
-        </w:rPr>
-        <w:t>Le nerf pudendal est une voie somatique distincte des nerfs splanchniques pelviens autonomes, même s’ils partagent une proximité segmentaire S2-S4.</w:t>
-      </w:r>
-    </w:p>
-    <w:p>
-      <w:pPr>
-        <w:pStyle w:val="Heading3"/>
-      </w:pPr>
-      <w:r>
-        <w:t>13.5.2. Versant viscéro-émotionnel</w:t>
-      </w:r>
-    </w:p>
-    <w:p>
-      <w:r>
-        <w:rPr>
-          <w:i w:val="0"/>
-        </w:rPr>
-        <w:t>La terminologie « balance cerveau limbique-vessie » est remplacée par « axe cerveau-vessie ». Cette expression décrit l’intégration des signaux vésicaux avec les réseaux cérébraux impliqués dans l’interoception, l’attention, l’urgence, le contrôle contextuel et le vécu émotionnel.</w:t>
-      </w:r>
-    </w:p>
-    <w:p>
-      <w:r>
-        <w:rPr>
-          <w:i w:val="0"/>
-        </w:rPr>
-        <w:t>Dans le modèle clinique ROP, l’écoute-induction peut conserver son principe — un repère sur la zone vésicale et un repère central — mais elle doit être présentée comme une technique d’intégration fonctionnelle, et non comme une action directe sur un « cerveau limbique ».</w:t>
-      </w:r>
-    </w:p>
-    <w:p>
-      <w:pPr>
-        <w:spacing w:after="80"/>
-      </w:pPr>
-      <w:r>
-        <w:rPr>
-          <w:i/>
-          <w:color w:val="5E666A"/>
-        </w:rPr>
-        <w:t>Cf. chapitre 3 — Système nerveux central pour les réseaux centraux et cortico-limbiques ; cf. section 11 « Relations viscéro-émotionnelles » du présent chapitre.</w:t>
-      </w:r>
-    </w:p>
-    <w:p>
-      <w:pPr>
-        <w:shd w:fill="F3EEE4"/>
-        <w:spacing w:before="80" w:after="100"/>
-        <w:ind w:left="142" w:right="142"/>
-      </w:pPr>
-      <w:r>
-        <w:rPr>
-          <w:b/>
-        </w:rPr>
-        <w:t xml:space="preserve">Intérêt en ROP — </w:t>
-      </w:r>
-      <w:r>
-        <w:t>Le Niveau 4 vise à relier le symptôme vésical aux convergences somatiques et au contexte de perception et d’adaptation, sans définir de « personnalité vessie » ni attribuer automatiquement un trouble urinaire à une origine émotionnelle.</w:t>
-      </w:r>
-    </w:p>
-    <w:p>
-      <w:pPr>
-        <w:pStyle w:val="Heading2"/>
-      </w:pPr>
-      <w:r>
-        <w:t>13.6. Soutiens associés selon les tests</w:t>
-      </w:r>
-    </w:p>
-    <w:p>
-      <w:r>
-        <w:rPr>
-          <w:i w:val="0"/>
-        </w:rPr>
-        <w:t>Les territoires foie, intestins et reins figuraient auparavant dans le « syndrome général d’adaptation ». Ils peuvent être conservés comme soutiens associés, mais ne doivent pas être considérés comme des étapes obligatoires du traitement de la vessie.</w:t>
+        <w:t>• Pollakiurie ou énurésie fonctionnelle : prise en compte du contrôle central, des habitudes mictionnelles, de l’axe cerveau-vessie et de la régulation autonome.</w:t>
       </w:r>
     </w:p>
     <w:p>
@@ -5738,137 +4200,7 @@
         <w:ind w:left="255" w:hanging="142"/>
       </w:pPr>
       <w:r>
-        <w:t xml:space="preserve">• </w:t>
-      </w:r>
-      <w:r>
-        <w:t>Reins et uretères : lorsque le contexte urinaire ou rénal le justifie.</w:t>
-      </w:r>
-    </w:p>
-    <w:p>
-      <w:pPr>
-        <w:pStyle w:val="ListParagraph"/>
-        <w:spacing w:after="36"/>
-        <w:ind w:left="255" w:hanging="142"/>
-      </w:pPr>
-      <w:r>
-        <w:t xml:space="preserve">• </w:t>
-      </w:r>
-      <w:r>
-        <w:t>Intestin et côlon : en présence de constipation, dysfonction digestive ou contexte pelvien associé.</w:t>
-      </w:r>
-    </w:p>
-    <w:p>
-      <w:pPr>
-        <w:pStyle w:val="ListParagraph"/>
-        <w:spacing w:after="36"/>
-        <w:ind w:left="255" w:hanging="142"/>
-      </w:pPr>
-      <w:r>
-        <w:t xml:space="preserve">• </w:t>
-      </w:r>
-      <w:r>
-        <w:t>Foie et autres territoires systémiques : uniquement lorsqu’ils sont retenus par l’anamnèse, les tests et la cohérence clinique.</w:t>
-      </w:r>
-    </w:p>
-    <w:p>
-      <w:pPr>
-        <w:shd w:fill="F3EEE4"/>
-        <w:spacing w:before="80" w:after="100"/>
-        <w:ind w:left="142" w:right="142"/>
-      </w:pPr>
-      <w:r>
-        <w:rPr>
-          <w:b/>
-        </w:rPr>
-        <w:t xml:space="preserve">Intérêt en ROP — </w:t>
-      </w:r>
-      <w:r>
-        <w:t>Ces soutiens complètent le protocole lorsqu’ils sont pertinents ; ils ne remplacent pas le ciblage des quatre niveaux propres à la fonction vésicale.</w:t>
-      </w:r>
-    </w:p>
-    <w:p>
-      <w:pPr>
-        <w:pStyle w:val="Heading2"/>
-      </w:pPr>
-      <w:r>
-        <w:t>13.7. Lecture clinique selon le symptôme</w:t>
-      </w:r>
-    </w:p>
-    <w:p>
-      <w:r>
-        <w:rPr>
-          <w:i w:val="0"/>
-        </w:rPr>
-        <w:t>La hiérarchie des zones varie selon le trouble fonctionnel et ne doit pas être appliquée comme une séquence rigide.</w:t>
-      </w:r>
-    </w:p>
-    <w:p>
-      <w:pPr>
-        <w:pStyle w:val="ListParagraph"/>
-        <w:spacing w:after="36"/>
-        <w:ind w:left="255" w:hanging="142"/>
-      </w:pPr>
-      <w:r>
-        <w:t xml:space="preserve">• </w:t>
-      </w:r>
-      <w:r>
-        <w:t>Hyperactivité vésicale / urgenturie : importance possible des Niveaux 1, 2 et 4, en complément du travail direct sur la vessie au Niveau 3.</w:t>
-      </w:r>
-    </w:p>
-    <w:p>
-      <w:pPr>
-        <w:pStyle w:val="ListParagraph"/>
-        <w:spacing w:after="36"/>
-        <w:ind w:left="255" w:hanging="142"/>
-      </w:pPr>
-      <w:r>
-        <w:t xml:space="preserve">• </w:t>
-      </w:r>
-      <w:r>
-        <w:t>Incontinence urinaire d’effort : priorité fréquente au Niveau 3 et au versant somatique du Niveau 4 — urètre, pubis, plancher pelvien, pudendal — avec intégration du Niveau 2 selon les tests.</w:t>
-      </w:r>
-    </w:p>
-    <w:p>
-      <w:pPr>
-        <w:pStyle w:val="ListParagraph"/>
-        <w:spacing w:after="36"/>
-        <w:ind w:left="255" w:hanging="142"/>
-      </w:pPr>
-      <w:r>
-        <w:t xml:space="preserve">• </w:t>
-      </w:r>
-      <w:r>
-        <w:t>Pollakiurie ou énurésie fonctionnelle : prise en compte du contrôle central, des habitudes mictionnelles, de l’axe cerveau-vessie et de la régulation autonome.</w:t>
-      </w:r>
-    </w:p>
-    <w:p>
-      <w:pPr>
-        <w:pStyle w:val="ListParagraph"/>
-        <w:spacing w:after="36"/>
-        <w:ind w:left="255" w:hanging="142"/>
-      </w:pPr>
-      <w:r>
-        <w:t xml:space="preserve">• </w:t>
-      </w:r>
-      <w:r>
-        <w:t>Cystalgie non infectieuse : lecture associant vessie, régulation autonome, plancher pelvien et hypersensibilité, après exclusion d’une infection ou d’une pathologie organique.</w:t>
-      </w:r>
-    </w:p>
-    <w:p>
-      <w:pPr>
-        <w:shd w:fill="F8E9E5"/>
-        <w:spacing w:before="80" w:after="100"/>
-        <w:ind w:left="142" w:right="142"/>
-      </w:pPr>
-      <w:r>
-        <w:rPr>
-          <w:b/>
-          <w:color w:val="4D5A60"/>
-        </w:rPr>
-        <w:t xml:space="preserve">Principe de sécurité. </w:t>
-      </w:r>
-      <w:r>
-        <w:t>Une zone réflexe sensible ou une modification palpatoire n’est pas un test diagnostique d’infection, de tumeur, de lésion neurologique ou d’autre pathologie organique. Toute hématurie, fièvre, rétention, douleur inhabituelle ou symptôme inexpliqué impose une évaluation médicale adaptée.</w:t>
+        <w:t>• Cystalgie non infectieuse : lecture associant vessie, régulation autonome, plancher pelvien et hypersensibilité, après exclusion d’une infection ou d’une pathologie organique.</w:t>
       </w:r>
     </w:p>
     <w:sectPr>
@@ -11230,11 +9562,10 @@
       <w:lang w:eastAsia="fr-FR"/>
     </w:rPr>
   </w:style>
-  <w:style w:type="paragraph" w:customStyle="1" w:styleId="Heading3">
-    <w:name w:val="heading 3"/>
+  <w:style w:type="paragraph" w:customStyle="1" w:styleId="Heading31">
+    <w:name w:val="Heading 31"/>
     <w:basedOn w:val="Heading2"/>
     <w:rPr>
-      <w:b/>
       <w:sz w:val="20"/>
     </w:rPr>
   </w:style>

</xml_diff>